<commit_message>
Project 2 simulink files added
</commit_message>
<xml_diff>
--- a/SpeedController/Report.docx
+++ b/SpeedController/Report.docx
@@ -118,17 +118,8 @@
           <w:i/>
           <w:iCs/>
         </w:rPr>
-        <w:t xml:space="preserve"> </w:t>
-      </w:r>
-      <w:proofErr w:type="spellStart"/>
-      <w:r>
-        <w:rPr>
-          <w:i/>
-          <w:iCs/>
-        </w:rPr>
-        <w:t>Jonsup</w:t>
-      </w:r>
-      <w:proofErr w:type="spellEnd"/>
+        <w:t xml:space="preserve"> Jonsup</w:t>
+      </w:r>
       <w:r>
         <w:rPr>
           <w:i/>
@@ -1537,13 +1528,7 @@
             <w:rPr>
               <w:rFonts w:ascii="Cambria Math" w:eastAsiaTheme="minorEastAsia" w:hAnsi="Cambria Math"/>
             </w:rPr>
-            <m:t>s</m:t>
-          </m:r>
-          <m:r>
-            <w:rPr>
-              <w:rFonts w:ascii="Cambria Math" w:eastAsiaTheme="minorEastAsia" w:hAnsi="Cambria Math"/>
-            </w:rPr>
-            <m:t>+</m:t>
+            <m:t>s+</m:t>
           </m:r>
           <m:sSub>
             <m:sSubPr>
@@ -1621,19 +1606,7 @@
             <w:rPr>
               <w:rFonts w:ascii="Cambria Math" w:eastAsiaTheme="minorEastAsia" w:hAnsi="Cambria Math"/>
             </w:rPr>
-            <m:t>(</m:t>
-          </m:r>
-          <m:r>
-            <w:rPr>
-              <w:rFonts w:ascii="Cambria Math" w:eastAsiaTheme="minorEastAsia" w:hAnsi="Cambria Math"/>
-            </w:rPr>
-            <m:t>s)</m:t>
-          </m:r>
-          <m:r>
-            <w:rPr>
-              <w:rFonts w:ascii="Cambria Math" w:eastAsiaTheme="minorEastAsia" w:hAnsi="Cambria Math"/>
-            </w:rPr>
-            <m:t>=</m:t>
+            <m:t>(s)=</m:t>
           </m:r>
           <m:sSub>
             <m:sSubPr>
@@ -1705,19 +1678,7 @@
             <w:rPr>
               <w:rFonts w:ascii="Cambria Math" w:eastAsiaTheme="minorEastAsia" w:hAnsi="Cambria Math"/>
             </w:rPr>
-            <m:t>(</m:t>
-          </m:r>
-          <m:r>
-            <w:rPr>
-              <w:rFonts w:ascii="Cambria Math" w:eastAsiaTheme="minorEastAsia" w:hAnsi="Cambria Math"/>
-            </w:rPr>
-            <m:t>s)</m:t>
-          </m:r>
-          <m:r>
-            <w:rPr>
-              <w:rFonts w:ascii="Cambria Math" w:eastAsiaTheme="minorEastAsia" w:hAnsi="Cambria Math"/>
-            </w:rPr>
-            <m:t>-</m:t>
+            <m:t>(s)-</m:t>
           </m:r>
           <m:sSub>
             <m:sSubPr>
@@ -1756,13 +1717,7 @@
             <w:rPr>
               <w:rFonts w:ascii="Cambria Math" w:eastAsiaTheme="minorEastAsia" w:hAnsi="Cambria Math"/>
             </w:rPr>
-            <m:t>(</m:t>
-          </m:r>
-          <m:r>
-            <w:rPr>
-              <w:rFonts w:ascii="Cambria Math" w:eastAsiaTheme="minorEastAsia" w:hAnsi="Cambria Math"/>
-            </w:rPr>
-            <m:t>s)</m:t>
+            <m:t>(s)</m:t>
           </m:r>
         </m:oMath>
       </m:oMathPara>
@@ -2162,6 +2117,9 @@
             </m:den>
           </m:f>
           <m:r>
+            <m:rPr>
+              <m:sty m:val="p"/>
+            </m:rPr>
             <w:rPr>
               <w:rFonts w:eastAsiaTheme="minorEastAsia"/>
             </w:rPr>
@@ -2454,6 +2412,9 @@
             </m:den>
           </m:f>
           <m:r>
+            <m:rPr>
+              <m:sty m:val="p"/>
+            </m:rPr>
             <w:rPr>
               <w:rFonts w:eastAsiaTheme="minorEastAsia"/>
             </w:rPr>
@@ -2764,6 +2725,9 @@
             </m:den>
           </m:f>
           <m:r>
+            <m:rPr>
+              <m:sty m:val="p"/>
+            </m:rPr>
             <w:rPr>
               <w:rFonts w:eastAsiaTheme="minorEastAsia"/>
             </w:rPr>
@@ -3219,6 +3183,9 @@
             </m:den>
           </m:f>
           <m:r>
+            <m:rPr>
+              <m:sty m:val="p"/>
+            </m:rPr>
             <w:rPr>
               <w:rFonts w:eastAsiaTheme="minorEastAsia"/>
             </w:rPr>
@@ -3326,13 +3293,8 @@
         </w:numPr>
         <w:spacing w:before="100" w:beforeAutospacing="1" w:after="100" w:afterAutospacing="1" w:line="240" w:lineRule="auto"/>
       </w:pPr>
-      <w:proofErr w:type="gramStart"/>
-      <w:r>
-        <w:t>Open-loop</w:t>
-      </w:r>
-      <w:proofErr w:type="gramEnd"/>
-      <w:r>
-        <w:t xml:space="preserve">: </w:t>
+      <w:r>
+        <w:t xml:space="preserve">Open-loop: </w:t>
       </w:r>
       <m:oMath>
         <m:sSub>
@@ -3412,13 +3374,8 @@
         </w:numPr>
         <w:spacing w:before="100" w:beforeAutospacing="1" w:after="100" w:afterAutospacing="1" w:line="240" w:lineRule="auto"/>
       </w:pPr>
-      <w:proofErr w:type="gramStart"/>
-      <w:r>
-        <w:t>Closed-loop</w:t>
-      </w:r>
-      <w:proofErr w:type="gramEnd"/>
-      <w:r>
-        <w:t xml:space="preserve">: </w:t>
+      <w:r>
+        <w:t xml:space="preserve">Closed-loop: </w:t>
       </w:r>
       <m:oMath>
         <m:sSub>
@@ -3930,14 +3887,58 @@
     <w:p>
       <w:pPr>
         <w:pStyle w:val="Heading3"/>
-      </w:pPr>
-      <w:r>
         <w:rPr>
           <w:rStyle w:val="Strong"/>
           <w:b w:val="0"/>
           <w:bCs w:val="0"/>
         </w:rPr>
+      </w:pPr>
+      <w:r>
+        <w:rPr>
+          <w:rStyle w:val="Strong"/>
+          <w:b w:val="0"/>
+          <w:bCs w:val="0"/>
+        </w:rPr>
         <w:t>Part A – Open-Loop Behavior</w:t>
+      </w:r>
+    </w:p>
+    <w:p>
+      <w:r>
+        <w:drawing>
+          <wp:inline distT="0" distB="0" distL="0" distR="0" wp14:anchorId="34A4C66F" wp14:editId="7E0A248D">
+            <wp:extent cx="5943600" cy="2075180"/>
+            <wp:effectExtent l="0" t="0" r="0" b="1270"/>
+            <wp:docPr id="311438674" name="Picture 1"/>
+            <wp:cNvGraphicFramePr>
+              <a:graphicFrameLocks xmlns:a="http://schemas.openxmlformats.org/drawingml/2006/main" noChangeAspect="1"/>
+            </wp:cNvGraphicFramePr>
+            <a:graphic xmlns:a="http://schemas.openxmlformats.org/drawingml/2006/main">
+              <a:graphicData uri="http://schemas.openxmlformats.org/drawingml/2006/picture">
+                <pic:pic xmlns:pic="http://schemas.openxmlformats.org/drawingml/2006/picture">
+                  <pic:nvPicPr>
+                    <pic:cNvPr id="311438674" name=""/>
+                    <pic:cNvPicPr/>
+                  </pic:nvPicPr>
+                  <pic:blipFill>
+                    <a:blip r:embed="rId6"/>
+                    <a:stretch>
+                      <a:fillRect/>
+                    </a:stretch>
+                  </pic:blipFill>
+                  <pic:spPr>
+                    <a:xfrm>
+                      <a:off x="0" y="0"/>
+                      <a:ext cx="5943600" cy="2075180"/>
+                    </a:xfrm>
+                    <a:prstGeom prst="rect">
+                      <a:avLst/>
+                    </a:prstGeom>
+                  </pic:spPr>
+                </pic:pic>
+              </a:graphicData>
+            </a:graphic>
+          </wp:inline>
+        </w:drawing>
       </w:r>
     </w:p>
     <w:p>
@@ -4046,6 +4047,9 @@
             <m:t xml:space="preserve"> rad/s</m:t>
           </m:r>
           <m:r>
+            <m:rPr>
+              <m:sty m:val="p"/>
+            </m:rPr>
             <w:br/>
           </m:r>
         </m:oMath>
@@ -4129,6 +4133,9 @@
             <m:t xml:space="preserve"> rad/s</m:t>
           </m:r>
           <m:r>
+            <m:rPr>
+              <m:sty m:val="p"/>
+            </m:rPr>
             <w:br/>
           </m:r>
         </m:oMath>
@@ -4139,6 +4146,9 @@
         <w:pStyle w:val="NormalWeb"/>
       </w:pPr>
       <w:r>
+        <w:rPr>
+          <w:noProof/>
+        </w:rPr>
         <w:lastRenderedPageBreak/>
         <w:drawing>
           <wp:inline distT="0" distB="0" distL="0" distR="0" wp14:anchorId="3031D462" wp14:editId="7DA5EA9C">
@@ -4156,7 +4166,7 @@
                     <pic:cNvPicPr/>
                   </pic:nvPicPr>
                   <pic:blipFill>
-                    <a:blip r:embed="rId6"/>
+                    <a:blip r:embed="rId7"/>
                     <a:stretch>
                       <a:fillRect/>
                     </a:stretch>
@@ -4202,60 +4212,1216 @@
         <w:rPr>
           <w:rFonts w:asciiTheme="minorHAnsi" w:hAnsiTheme="minorHAnsi"/>
         </w:rPr>
-        <w:t xml:space="preserve">Additionally, once the disturbance is applied, the system settles to a new steady-state value without recovering. This demonstrates that open-loop systems lack the ability to compensate for disturbances, resulting in a permanent </w:t>
-      </w:r>
-      <w:proofErr w:type="gramStart"/>
-      <w:r>
-        <w:rPr>
-          <w:rFonts w:asciiTheme="minorHAnsi" w:hAnsiTheme="minorHAnsi"/>
-        </w:rPr>
-        <w:t>steady-state</w:t>
-      </w:r>
-      <w:proofErr w:type="gramEnd"/>
-      <w:r>
-        <w:rPr>
-          <w:rFonts w:asciiTheme="minorHAnsi" w:hAnsiTheme="minorHAnsi"/>
-        </w:rPr>
-        <w:t xml:space="preserve"> error.</w:t>
-      </w:r>
-    </w:p>
-    <w:p>
-      <w:pPr>
-        <w:pStyle w:val="NormalWeb"/>
-      </w:pPr>
-    </w:p>
-    <w:p>
-      <w:pPr>
-        <w:pStyle w:val="NormalWeb"/>
-        <w:rPr>
-          <w:color w:val="EE0000"/>
-        </w:rPr>
-      </w:pPr>
-      <w:r>
-        <w:rPr>
-          <w:color w:val="EE0000"/>
-        </w:rPr>
-        <w:t>LEAVE ROOM FOR PART B</w:t>
-      </w:r>
-    </w:p>
-    <w:p>
-      <w:pPr>
-        <w:pStyle w:val="NormalWeb"/>
-        <w:rPr>
-          <w:color w:val="EE0000"/>
-        </w:rPr>
-      </w:pPr>
-    </w:p>
-    <w:p>
-      <w:pPr>
-        <w:pStyle w:val="Heading3"/>
-      </w:pPr>
-      <w:r>
+        <w:t>Additionally, once the disturbance is applied, the system settles to a new steady-state value without recovering. This demonstrates that open-loop systems lack the ability to compensate for disturbances, resulting in a permanent steady-state error.</w:t>
+      </w:r>
+    </w:p>
+    <w:p>
+      <w:pPr>
+        <w:pStyle w:val="Heading2"/>
         <w:rPr>
           <w:rStyle w:val="Strong"/>
           <w:b w:val="0"/>
           <w:bCs w:val="0"/>
         </w:rPr>
+      </w:pPr>
+      <w:r>
+        <w:rPr>
+          <w:rStyle w:val="Strong"/>
+          <w:b w:val="0"/>
+          <w:bCs w:val="0"/>
+        </w:rPr>
+        <w:t>Part B – Closed-Loop Behavior</w:t>
+      </w:r>
+    </w:p>
+    <w:p>
+      <w:r>
+        <w:drawing>
+          <wp:inline distT="0" distB="0" distL="0" distR="0" wp14:anchorId="6E680A13" wp14:editId="652A17B9">
+            <wp:extent cx="5943600" cy="2342515"/>
+            <wp:effectExtent l="0" t="0" r="0" b="635"/>
+            <wp:docPr id="322536893" name="Picture 1"/>
+            <wp:cNvGraphicFramePr>
+              <a:graphicFrameLocks xmlns:a="http://schemas.openxmlformats.org/drawingml/2006/main" noChangeAspect="1"/>
+            </wp:cNvGraphicFramePr>
+            <a:graphic xmlns:a="http://schemas.openxmlformats.org/drawingml/2006/main">
+              <a:graphicData uri="http://schemas.openxmlformats.org/drawingml/2006/picture">
+                <pic:pic xmlns:pic="http://schemas.openxmlformats.org/drawingml/2006/picture">
+                  <pic:nvPicPr>
+                    <pic:cNvPr id="322536893" name=""/>
+                    <pic:cNvPicPr/>
+                  </pic:nvPicPr>
+                  <pic:blipFill>
+                    <a:blip r:embed="rId8"/>
+                    <a:stretch>
+                      <a:fillRect/>
+                    </a:stretch>
+                  </pic:blipFill>
+                  <pic:spPr>
+                    <a:xfrm>
+                      <a:off x="0" y="0"/>
+                      <a:ext cx="5943600" cy="2342515"/>
+                    </a:xfrm>
+                    <a:prstGeom prst="rect">
+                      <a:avLst/>
+                    </a:prstGeom>
+                  </pic:spPr>
+                </pic:pic>
+              </a:graphicData>
+            </a:graphic>
+          </wp:inline>
+        </w:drawing>
+      </w:r>
+    </w:p>
+    <w:p>
+      <w:pPr>
+        <w:pStyle w:val="NormalWeb"/>
+      </w:pPr>
+      <w:r>
+        <w:t>In Part B, the system was modified to include feedback, forming a closed-loop speed control system. The purpose of this configuration is to reduce the effect of disturbance torque and improve the system’s ability to maintain a desired reference speed.</w:t>
+      </w:r>
+    </w:p>
+    <w:p>
+      <w:pPr>
+        <w:pStyle w:val="NormalWeb"/>
+      </w:pPr>
+      <w:r>
+        <w:t xml:space="preserve">The closed-loop system consists of a sensor with gain </w:t>
+      </w:r>
+      <m:oMath>
+        <m:sSub>
+          <m:sSubPr>
+            <m:ctrlPr>
+              <w:rPr>
+                <w:rFonts w:ascii="Cambria Math" w:hAnsi="Cambria Math"/>
+              </w:rPr>
+            </m:ctrlPr>
+          </m:sSubPr>
+          <m:e>
+            <m:r>
+              <w:rPr>
+                <w:rFonts w:ascii="Cambria Math" w:hAnsi="Cambria Math"/>
+              </w:rPr>
+              <m:t>K</m:t>
+            </m:r>
+          </m:e>
+          <m:sub>
+            <m:r>
+              <w:rPr>
+                <w:rFonts w:ascii="Cambria Math" w:hAnsi="Cambria Math"/>
+              </w:rPr>
+              <m:t>s</m:t>
+            </m:r>
+          </m:sub>
+        </m:sSub>
+        <m:r>
+          <w:rPr>
+            <w:rFonts w:ascii="Cambria Math" w:hAnsi="Cambria Math"/>
+          </w:rPr>
+          <m:t>=1</m:t>
+        </m:r>
+      </m:oMath>
+      <w:r>
+        <w:t xml:space="preserve">, which measures the motor speed, and an amplifier with gain </w:t>
+      </w:r>
+      <m:oMath>
+        <m:sSub>
+          <m:sSubPr>
+            <m:ctrlPr>
+              <w:rPr>
+                <w:rFonts w:ascii="Cambria Math" w:hAnsi="Cambria Math"/>
+              </w:rPr>
+            </m:ctrlPr>
+          </m:sSubPr>
+          <m:e>
+            <m:r>
+              <w:rPr>
+                <w:rFonts w:ascii="Cambria Math" w:hAnsi="Cambria Math"/>
+              </w:rPr>
+              <m:t>K</m:t>
+            </m:r>
+          </m:e>
+          <m:sub>
+            <m:r>
+              <w:rPr>
+                <w:rFonts w:ascii="Cambria Math" w:hAnsi="Cambria Math"/>
+              </w:rPr>
+              <m:t>a</m:t>
+            </m:r>
+          </m:sub>
+        </m:sSub>
+      </m:oMath>
+      <w:r>
+        <w:t xml:space="preserve">, which acts as the controller. The measured speed is fed back and </w:t>
+      </w:r>
+      <w:r>
+        <w:lastRenderedPageBreak/>
+        <w:t xml:space="preserve">compared to the reference input </w:t>
+      </w:r>
+      <m:oMath>
+        <m:sSub>
+          <m:sSubPr>
+            <m:ctrlPr>
+              <w:rPr>
+                <w:rFonts w:ascii="Cambria Math" w:hAnsi="Cambria Math"/>
+              </w:rPr>
+            </m:ctrlPr>
+          </m:sSubPr>
+          <m:e>
+            <m:r>
+              <w:rPr>
+                <w:rFonts w:ascii="Cambria Math" w:hAnsi="Cambria Math"/>
+              </w:rPr>
+              <m:t>ω</m:t>
+            </m:r>
+          </m:e>
+          <m:sub>
+            <m:r>
+              <w:rPr>
+                <w:rFonts w:ascii="Cambria Math" w:hAnsi="Cambria Math"/>
+              </w:rPr>
+              <m:t>mref</m:t>
+            </m:r>
+          </m:sub>
+        </m:sSub>
+      </m:oMath>
+      <w:r>
+        <w:t>, producing an error signal. This error is amplified and used to drive the motor input voltage.</w:t>
+      </w:r>
+    </w:p>
+    <w:p>
+      <w:pPr>
+        <w:pStyle w:val="NormalWeb"/>
+      </w:pPr>
+      <w:r>
+        <w:t>The resulting closed-loop disturbance transfer function is:</w:t>
+      </w:r>
+    </w:p>
+    <w:p>
+      <m:oMathPara>
+        <m:oMath>
+          <m:f>
+            <m:fPr>
+              <m:ctrlPr>
+                <w:rPr>
+                  <w:rFonts w:ascii="Cambria Math" w:hAnsi="Cambria Math"/>
+                </w:rPr>
+              </m:ctrlPr>
+            </m:fPr>
+            <m:num>
+              <m:sSub>
+                <m:sSubPr>
+                  <m:ctrlPr>
+                    <w:rPr>
+                      <w:rFonts w:ascii="Cambria Math" w:hAnsi="Cambria Math"/>
+                    </w:rPr>
+                  </m:ctrlPr>
+                </m:sSubPr>
+                <m:e>
+                  <m:r>
+                    <w:rPr>
+                      <w:rFonts w:ascii="Cambria Math" w:hAnsi="Cambria Math"/>
+                    </w:rPr>
+                    <m:t>ω</m:t>
+                  </m:r>
+                </m:e>
+                <m:sub>
+                  <m:r>
+                    <w:rPr>
+                      <w:rFonts w:ascii="Cambria Math" w:hAnsi="Cambria Math"/>
+                    </w:rPr>
+                    <m:t>m</m:t>
+                  </m:r>
+                </m:sub>
+              </m:sSub>
+              <m:r>
+                <w:rPr>
+                  <w:rFonts w:ascii="Cambria Math" w:hAnsi="Cambria Math"/>
+                </w:rPr>
+                <m:t>(s)</m:t>
+              </m:r>
+            </m:num>
+            <m:den>
+              <m:sSub>
+                <m:sSubPr>
+                  <m:ctrlPr>
+                    <w:rPr>
+                      <w:rFonts w:ascii="Cambria Math" w:hAnsi="Cambria Math"/>
+                    </w:rPr>
+                  </m:ctrlPr>
+                </m:sSubPr>
+                <m:e>
+                  <m:r>
+                    <w:rPr>
+                      <w:rFonts w:ascii="Cambria Math" w:hAnsi="Cambria Math"/>
+                    </w:rPr>
+                    <m:t>T</m:t>
+                  </m:r>
+                </m:e>
+                <m:sub>
+                  <m:r>
+                    <w:rPr>
+                      <w:rFonts w:ascii="Cambria Math" w:hAnsi="Cambria Math"/>
+                    </w:rPr>
+                    <m:t>L</m:t>
+                  </m:r>
+                </m:sub>
+              </m:sSub>
+              <m:r>
+                <w:rPr>
+                  <w:rFonts w:ascii="Cambria Math" w:hAnsi="Cambria Math"/>
+                </w:rPr>
+                <m:t>(s)</m:t>
+              </m:r>
+            </m:den>
+          </m:f>
+          <m:r>
+            <w:rPr>
+              <w:rFonts w:ascii="Cambria Math" w:hAnsi="Cambria Math"/>
+            </w:rPr>
+            <m:t>=-</m:t>
+          </m:r>
+          <m:f>
+            <m:fPr>
+              <m:ctrlPr>
+                <w:rPr>
+                  <w:rFonts w:ascii="Cambria Math" w:hAnsi="Cambria Math"/>
+                </w:rPr>
+              </m:ctrlPr>
+            </m:fPr>
+            <m:num>
+              <m:sSub>
+                <m:sSubPr>
+                  <m:ctrlPr>
+                    <w:rPr>
+                      <w:rFonts w:ascii="Cambria Math" w:hAnsi="Cambria Math"/>
+                    </w:rPr>
+                  </m:ctrlPr>
+                </m:sSubPr>
+                <m:e>
+                  <m:r>
+                    <w:rPr>
+                      <w:rFonts w:ascii="Cambria Math" w:hAnsi="Cambria Math"/>
+                    </w:rPr>
+                    <m:t>L</m:t>
+                  </m:r>
+                </m:e>
+                <m:sub>
+                  <m:r>
+                    <w:rPr>
+                      <w:rFonts w:ascii="Cambria Math" w:hAnsi="Cambria Math"/>
+                    </w:rPr>
+                    <m:t>a</m:t>
+                  </m:r>
+                </m:sub>
+              </m:sSub>
+              <m:r>
+                <w:rPr>
+                  <w:rFonts w:ascii="Cambria Math" w:hAnsi="Cambria Math"/>
+                </w:rPr>
+                <m:t>s+</m:t>
+              </m:r>
+              <m:sSub>
+                <m:sSubPr>
+                  <m:ctrlPr>
+                    <w:rPr>
+                      <w:rFonts w:ascii="Cambria Math" w:hAnsi="Cambria Math"/>
+                    </w:rPr>
+                  </m:ctrlPr>
+                </m:sSubPr>
+                <m:e>
+                  <m:r>
+                    <w:rPr>
+                      <w:rFonts w:ascii="Cambria Math" w:hAnsi="Cambria Math"/>
+                    </w:rPr>
+                    <m:t>R</m:t>
+                  </m:r>
+                </m:e>
+                <m:sub>
+                  <m:r>
+                    <w:rPr>
+                      <w:rFonts w:ascii="Cambria Math" w:hAnsi="Cambria Math"/>
+                    </w:rPr>
+                    <m:t>a</m:t>
+                  </m:r>
+                </m:sub>
+              </m:sSub>
+            </m:num>
+            <m:den>
+              <m:r>
+                <w:rPr>
+                  <w:rFonts w:ascii="Cambria Math" w:hAnsi="Cambria Math"/>
+                </w:rPr>
+                <m:t>(</m:t>
+              </m:r>
+              <m:sSub>
+                <m:sSubPr>
+                  <m:ctrlPr>
+                    <w:rPr>
+                      <w:rFonts w:ascii="Cambria Math" w:hAnsi="Cambria Math"/>
+                    </w:rPr>
+                  </m:ctrlPr>
+                </m:sSubPr>
+                <m:e>
+                  <m:r>
+                    <w:rPr>
+                      <w:rFonts w:ascii="Cambria Math" w:hAnsi="Cambria Math"/>
+                    </w:rPr>
+                    <m:t>J</m:t>
+                  </m:r>
+                </m:e>
+                <m:sub>
+                  <m:r>
+                    <w:rPr>
+                      <w:rFonts w:ascii="Cambria Math" w:hAnsi="Cambria Math"/>
+                    </w:rPr>
+                    <m:t>m</m:t>
+                  </m:r>
+                </m:sub>
+              </m:sSub>
+              <m:r>
+                <w:rPr>
+                  <w:rFonts w:ascii="Cambria Math" w:hAnsi="Cambria Math"/>
+                </w:rPr>
+                <m:t>s+</m:t>
+              </m:r>
+              <m:sSub>
+                <m:sSubPr>
+                  <m:ctrlPr>
+                    <w:rPr>
+                      <w:rFonts w:ascii="Cambria Math" w:hAnsi="Cambria Math"/>
+                    </w:rPr>
+                  </m:ctrlPr>
+                </m:sSubPr>
+                <m:e>
+                  <m:r>
+                    <w:rPr>
+                      <w:rFonts w:ascii="Cambria Math" w:hAnsi="Cambria Math"/>
+                    </w:rPr>
+                    <m:t>B</m:t>
+                  </m:r>
+                </m:e>
+                <m:sub>
+                  <m:r>
+                    <w:rPr>
+                      <w:rFonts w:ascii="Cambria Math" w:hAnsi="Cambria Math"/>
+                    </w:rPr>
+                    <m:t>m</m:t>
+                  </m:r>
+                </m:sub>
+              </m:sSub>
+              <m:r>
+                <w:rPr>
+                  <w:rFonts w:ascii="Cambria Math" w:hAnsi="Cambria Math"/>
+                </w:rPr>
+                <m:t>)(</m:t>
+              </m:r>
+              <m:sSub>
+                <m:sSubPr>
+                  <m:ctrlPr>
+                    <w:rPr>
+                      <w:rFonts w:ascii="Cambria Math" w:hAnsi="Cambria Math"/>
+                    </w:rPr>
+                  </m:ctrlPr>
+                </m:sSubPr>
+                <m:e>
+                  <m:r>
+                    <w:rPr>
+                      <w:rFonts w:ascii="Cambria Math" w:hAnsi="Cambria Math"/>
+                    </w:rPr>
+                    <m:t>L</m:t>
+                  </m:r>
+                </m:e>
+                <m:sub>
+                  <m:r>
+                    <w:rPr>
+                      <w:rFonts w:ascii="Cambria Math" w:hAnsi="Cambria Math"/>
+                    </w:rPr>
+                    <m:t>a</m:t>
+                  </m:r>
+                </m:sub>
+              </m:sSub>
+              <m:r>
+                <w:rPr>
+                  <w:rFonts w:ascii="Cambria Math" w:hAnsi="Cambria Math"/>
+                </w:rPr>
+                <m:t>s+</m:t>
+              </m:r>
+              <m:sSub>
+                <m:sSubPr>
+                  <m:ctrlPr>
+                    <w:rPr>
+                      <w:rFonts w:ascii="Cambria Math" w:hAnsi="Cambria Math"/>
+                    </w:rPr>
+                  </m:ctrlPr>
+                </m:sSubPr>
+                <m:e>
+                  <m:r>
+                    <w:rPr>
+                      <w:rFonts w:ascii="Cambria Math" w:hAnsi="Cambria Math"/>
+                    </w:rPr>
+                    <m:t>R</m:t>
+                  </m:r>
+                </m:e>
+                <m:sub>
+                  <m:r>
+                    <w:rPr>
+                      <w:rFonts w:ascii="Cambria Math" w:hAnsi="Cambria Math"/>
+                    </w:rPr>
+                    <m:t>a</m:t>
+                  </m:r>
+                </m:sub>
+              </m:sSub>
+              <m:r>
+                <w:rPr>
+                  <w:rFonts w:ascii="Cambria Math" w:hAnsi="Cambria Math"/>
+                </w:rPr>
+                <m:t>)+</m:t>
+              </m:r>
+              <m:sSub>
+                <m:sSubPr>
+                  <m:ctrlPr>
+                    <w:rPr>
+                      <w:rFonts w:ascii="Cambria Math" w:hAnsi="Cambria Math"/>
+                    </w:rPr>
+                  </m:ctrlPr>
+                </m:sSubPr>
+                <m:e>
+                  <m:r>
+                    <w:rPr>
+                      <w:rFonts w:ascii="Cambria Math" w:hAnsi="Cambria Math"/>
+                    </w:rPr>
+                    <m:t>K</m:t>
+                  </m:r>
+                </m:e>
+                <m:sub>
+                  <m:r>
+                    <w:rPr>
+                      <w:rFonts w:ascii="Cambria Math" w:hAnsi="Cambria Math"/>
+                    </w:rPr>
+                    <m:t>i</m:t>
+                  </m:r>
+                </m:sub>
+              </m:sSub>
+              <m:sSub>
+                <m:sSubPr>
+                  <m:ctrlPr>
+                    <w:rPr>
+                      <w:rFonts w:ascii="Cambria Math" w:hAnsi="Cambria Math"/>
+                    </w:rPr>
+                  </m:ctrlPr>
+                </m:sSubPr>
+                <m:e>
+                  <m:r>
+                    <w:rPr>
+                      <w:rFonts w:ascii="Cambria Math" w:hAnsi="Cambria Math"/>
+                    </w:rPr>
+                    <m:t>K</m:t>
+                  </m:r>
+                </m:e>
+                <m:sub>
+                  <m:r>
+                    <w:rPr>
+                      <w:rFonts w:ascii="Cambria Math" w:hAnsi="Cambria Math"/>
+                    </w:rPr>
+                    <m:t>b</m:t>
+                  </m:r>
+                </m:sub>
+              </m:sSub>
+              <m:r>
+                <w:rPr>
+                  <w:rFonts w:ascii="Cambria Math" w:hAnsi="Cambria Math"/>
+                </w:rPr>
+                <m:t>+</m:t>
+              </m:r>
+              <m:sSub>
+                <m:sSubPr>
+                  <m:ctrlPr>
+                    <w:rPr>
+                      <w:rFonts w:ascii="Cambria Math" w:hAnsi="Cambria Math"/>
+                    </w:rPr>
+                  </m:ctrlPr>
+                </m:sSubPr>
+                <m:e>
+                  <m:r>
+                    <w:rPr>
+                      <w:rFonts w:ascii="Cambria Math" w:hAnsi="Cambria Math"/>
+                    </w:rPr>
+                    <m:t>K</m:t>
+                  </m:r>
+                </m:e>
+                <m:sub>
+                  <m:r>
+                    <w:rPr>
+                      <w:rFonts w:ascii="Cambria Math" w:hAnsi="Cambria Math"/>
+                    </w:rPr>
+                    <m:t>a</m:t>
+                  </m:r>
+                </m:sub>
+              </m:sSub>
+              <m:sSub>
+                <m:sSubPr>
+                  <m:ctrlPr>
+                    <w:rPr>
+                      <w:rFonts w:ascii="Cambria Math" w:hAnsi="Cambria Math"/>
+                    </w:rPr>
+                  </m:ctrlPr>
+                </m:sSubPr>
+                <m:e>
+                  <m:r>
+                    <w:rPr>
+                      <w:rFonts w:ascii="Cambria Math" w:hAnsi="Cambria Math"/>
+                    </w:rPr>
+                    <m:t>K</m:t>
+                  </m:r>
+                </m:e>
+                <m:sub>
+                  <m:r>
+                    <w:rPr>
+                      <w:rFonts w:ascii="Cambria Math" w:hAnsi="Cambria Math"/>
+                    </w:rPr>
+                    <m:t>s</m:t>
+                  </m:r>
+                </m:sub>
+              </m:sSub>
+              <m:sSub>
+                <m:sSubPr>
+                  <m:ctrlPr>
+                    <w:rPr>
+                      <w:rFonts w:ascii="Cambria Math" w:hAnsi="Cambria Math"/>
+                    </w:rPr>
+                  </m:ctrlPr>
+                </m:sSubPr>
+                <m:e>
+                  <m:r>
+                    <w:rPr>
+                      <w:rFonts w:ascii="Cambria Math" w:hAnsi="Cambria Math"/>
+                    </w:rPr>
+                    <m:t>K</m:t>
+                  </m:r>
+                </m:e>
+                <m:sub>
+                  <m:r>
+                    <w:rPr>
+                      <w:rFonts w:ascii="Cambria Math" w:hAnsi="Cambria Math"/>
+                    </w:rPr>
+                    <m:t>i</m:t>
+                  </m:r>
+                </m:sub>
+              </m:sSub>
+            </m:den>
+          </m:f>
+          <m:r>
+            <w:rPr>
+              <w:rFonts w:ascii="Cambria Math" w:hAnsi="Cambria Math"/>
+            </w:rPr>
+            <w:br/>
+          </m:r>
+        </m:oMath>
+      </m:oMathPara>
+    </w:p>
+    <w:p>
+      <w:pPr>
+        <w:pStyle w:val="NormalWeb"/>
+      </w:pPr>
+      <w:r>
+        <w:t xml:space="preserve">Compared to the open-loop case, the denominator now includes the additional term </w:t>
+      </w:r>
+      <m:oMath>
+        <m:sSub>
+          <m:sSubPr>
+            <m:ctrlPr>
+              <w:rPr>
+                <w:rFonts w:ascii="Cambria Math" w:hAnsi="Cambria Math"/>
+              </w:rPr>
+            </m:ctrlPr>
+          </m:sSubPr>
+          <m:e>
+            <m:r>
+              <w:rPr>
+                <w:rFonts w:ascii="Cambria Math" w:hAnsi="Cambria Math"/>
+              </w:rPr>
+              <m:t>K</m:t>
+            </m:r>
+          </m:e>
+          <m:sub>
+            <m:r>
+              <w:rPr>
+                <w:rFonts w:ascii="Cambria Math" w:hAnsi="Cambria Math"/>
+              </w:rPr>
+              <m:t>a</m:t>
+            </m:r>
+          </m:sub>
+        </m:sSub>
+        <m:sSub>
+          <m:sSubPr>
+            <m:ctrlPr>
+              <w:rPr>
+                <w:rFonts w:ascii="Cambria Math" w:hAnsi="Cambria Math"/>
+              </w:rPr>
+            </m:ctrlPr>
+          </m:sSubPr>
+          <m:e>
+            <m:r>
+              <w:rPr>
+                <w:rFonts w:ascii="Cambria Math" w:hAnsi="Cambria Math"/>
+              </w:rPr>
+              <m:t>K</m:t>
+            </m:r>
+          </m:e>
+          <m:sub>
+            <m:r>
+              <w:rPr>
+                <w:rFonts w:ascii="Cambria Math" w:hAnsi="Cambria Math"/>
+              </w:rPr>
+              <m:t>s</m:t>
+            </m:r>
+          </m:sub>
+        </m:sSub>
+        <m:sSub>
+          <m:sSubPr>
+            <m:ctrlPr>
+              <w:rPr>
+                <w:rFonts w:ascii="Cambria Math" w:hAnsi="Cambria Math"/>
+              </w:rPr>
+            </m:ctrlPr>
+          </m:sSubPr>
+          <m:e>
+            <m:r>
+              <w:rPr>
+                <w:rFonts w:ascii="Cambria Math" w:hAnsi="Cambria Math"/>
+              </w:rPr>
+              <m:t>K</m:t>
+            </m:r>
+          </m:e>
+          <m:sub>
+            <m:r>
+              <w:rPr>
+                <w:rFonts w:ascii="Cambria Math" w:hAnsi="Cambria Math"/>
+              </w:rPr>
+              <m:t>i</m:t>
+            </m:r>
+          </m:sub>
+        </m:sSub>
+      </m:oMath>
+      <w:r>
+        <w:t>. This increases the overall system gain and effectively reduces the impact of the disturbance on the output.</w:t>
+      </w:r>
+    </w:p>
+    <w:p>
+      <w:pPr>
+        <w:pStyle w:val="Heading3"/>
+      </w:pPr>
+      <w:r>
+        <w:rPr>
+          <w:rStyle w:val="Strong"/>
+          <w:b w:val="0"/>
+          <w:bCs w:val="0"/>
+        </w:rPr>
+        <w:t xml:space="preserve">Case 1: </w:t>
+      </w:r>
+      <m:oMath>
+        <m:sSub>
+          <m:sSubPr>
+            <m:ctrlPr>
+              <w:rPr>
+                <w:rFonts w:ascii="Cambria Math" w:hAnsi="Cambria Math"/>
+              </w:rPr>
+            </m:ctrlPr>
+          </m:sSubPr>
+          <m:e>
+            <m:r>
+              <w:rPr>
+                <w:rFonts w:ascii="Cambria Math" w:hAnsi="Cambria Math"/>
+              </w:rPr>
+              <m:t>ω</m:t>
+            </m:r>
+          </m:e>
+          <m:sub>
+            <m:r>
+              <w:rPr>
+                <w:rFonts w:ascii="Cambria Math" w:hAnsi="Cambria Math"/>
+              </w:rPr>
+              <m:t>mref</m:t>
+            </m:r>
+          </m:sub>
+        </m:sSub>
+        <m:r>
+          <w:rPr>
+            <w:rFonts w:ascii="Cambria Math" w:hAnsi="Cambria Math"/>
+          </w:rPr>
+          <m:t>=0,</m:t>
+        </m:r>
+        <m:r>
+          <m:rPr>
+            <m:nor/>
+          </m:rPr>
+          <w:rPr>
+            <w:rFonts w:ascii="Arial" w:hAnsi="Arial" w:cs="Arial"/>
+          </w:rPr>
+          <m:t>  </m:t>
+        </m:r>
+        <m:sSub>
+          <m:sSubPr>
+            <m:ctrlPr>
+              <w:rPr>
+                <w:rFonts w:ascii="Cambria Math" w:hAnsi="Cambria Math"/>
+              </w:rPr>
+            </m:ctrlPr>
+          </m:sSubPr>
+          <m:e>
+            <m:r>
+              <w:rPr>
+                <w:rFonts w:ascii="Cambria Math" w:hAnsi="Cambria Math"/>
+              </w:rPr>
+              <m:t>K</m:t>
+            </m:r>
+          </m:e>
+          <m:sub>
+            <m:r>
+              <w:rPr>
+                <w:rFonts w:ascii="Cambria Math" w:hAnsi="Cambria Math"/>
+              </w:rPr>
+              <m:t>a</m:t>
+            </m:r>
+          </m:sub>
+        </m:sSub>
+        <m:r>
+          <w:rPr>
+            <w:rFonts w:ascii="Cambria Math" w:hAnsi="Cambria Math"/>
+          </w:rPr>
+          <m:t>=5</m:t>
+        </m:r>
+      </m:oMath>
+    </w:p>
+    <w:p>
+      <w:r>
+        <w:drawing>
+          <wp:inline distT="0" distB="0" distL="0" distR="0" wp14:anchorId="51F1E468" wp14:editId="47D45587">
+            <wp:extent cx="4629796" cy="3762900"/>
+            <wp:effectExtent l="0" t="0" r="0" b="9525"/>
+            <wp:docPr id="426125721" name="Picture 1"/>
+            <wp:cNvGraphicFramePr>
+              <a:graphicFrameLocks xmlns:a="http://schemas.openxmlformats.org/drawingml/2006/main" noChangeAspect="1"/>
+            </wp:cNvGraphicFramePr>
+            <a:graphic xmlns:a="http://schemas.openxmlformats.org/drawingml/2006/main">
+              <a:graphicData uri="http://schemas.openxmlformats.org/drawingml/2006/picture">
+                <pic:pic xmlns:pic="http://schemas.openxmlformats.org/drawingml/2006/picture">
+                  <pic:nvPicPr>
+                    <pic:cNvPr id="426125721" name=""/>
+                    <pic:cNvPicPr/>
+                  </pic:nvPicPr>
+                  <pic:blipFill>
+                    <a:blip r:embed="rId9"/>
+                    <a:stretch>
+                      <a:fillRect/>
+                    </a:stretch>
+                  </pic:blipFill>
+                  <pic:spPr>
+                    <a:xfrm>
+                      <a:off x="0" y="0"/>
+                      <a:ext cx="4629796" cy="3762900"/>
+                    </a:xfrm>
+                    <a:prstGeom prst="rect">
+                      <a:avLst/>
+                    </a:prstGeom>
+                  </pic:spPr>
+                </pic:pic>
+              </a:graphicData>
+            </a:graphic>
+          </wp:inline>
+        </w:drawing>
+      </w:r>
+    </w:p>
+    <w:p>
+      <w:pPr>
+        <w:pStyle w:val="NormalWeb"/>
+      </w:pPr>
+      <w:r>
+        <w:t xml:space="preserve">In this case, the reference speed is set to zero. Ideally, the motor should remain at rest. When the disturbance torque is applied at </w:t>
+      </w:r>
+      <m:oMath>
+        <m:r>
+          <w:rPr>
+            <w:rFonts w:ascii="Cambria Math" w:hAnsi="Cambria Math"/>
+          </w:rPr>
+          <m:t>t=2</m:t>
+        </m:r>
+      </m:oMath>
+      <w:r>
+        <w:t>seconds, a small deviation in speed is observed due to the external load.</w:t>
+      </w:r>
+    </w:p>
+    <w:p>
+      <w:pPr>
+        <w:pStyle w:val="NormalWeb"/>
+      </w:pPr>
+      <w:r>
+        <w:t>However, unlike the open-loop system, the closed-loop system detects this deviation through feedback and generates a corrective input. As a result, the motor speed quickly returns to zero after a short transient response.</w:t>
+      </w:r>
+    </w:p>
+    <w:p>
+      <w:pPr>
+        <w:pStyle w:val="NormalWeb"/>
+      </w:pPr>
+      <w:r>
+        <w:lastRenderedPageBreak/>
+        <w:t>This demonstrates that the closed-loop system is capable of actively rejecting disturbances and maintaining the desired operating condition even when external disturbances are present.</w:t>
+      </w:r>
+    </w:p>
+    <w:p>
+      <w:pPr>
+        <w:pStyle w:val="Heading3"/>
+      </w:pPr>
+      <w:r>
+        <w:rPr>
+          <w:rStyle w:val="Strong"/>
+          <w:b w:val="0"/>
+          <w:bCs w:val="0"/>
+        </w:rPr>
+        <w:t xml:space="preserve">Case 2: </w:t>
+      </w:r>
+      <m:oMath>
+        <m:sSub>
+          <m:sSubPr>
+            <m:ctrlPr>
+              <w:rPr>
+                <w:rFonts w:ascii="Cambria Math" w:hAnsi="Cambria Math"/>
+              </w:rPr>
+            </m:ctrlPr>
+          </m:sSubPr>
+          <m:e>
+            <m:r>
+              <w:rPr>
+                <w:rFonts w:ascii="Cambria Math" w:hAnsi="Cambria Math"/>
+              </w:rPr>
+              <m:t>ω</m:t>
+            </m:r>
+          </m:e>
+          <m:sub>
+            <m:r>
+              <w:rPr>
+                <w:rFonts w:ascii="Cambria Math" w:hAnsi="Cambria Math"/>
+              </w:rPr>
+              <m:t>mref</m:t>
+            </m:r>
+          </m:sub>
+        </m:sSub>
+        <m:r>
+          <w:rPr>
+            <w:rFonts w:ascii="Cambria Math" w:hAnsi="Cambria Math"/>
+          </w:rPr>
+          <m:t>=140,</m:t>
+        </m:r>
+        <m:r>
+          <m:rPr>
+            <m:nor/>
+          </m:rPr>
+          <w:rPr>
+            <w:rFonts w:ascii="Arial" w:hAnsi="Arial" w:cs="Arial"/>
+          </w:rPr>
+          <m:t>  </m:t>
+        </m:r>
+        <m:sSub>
+          <m:sSubPr>
+            <m:ctrlPr>
+              <w:rPr>
+                <w:rFonts w:ascii="Cambria Math" w:hAnsi="Cambria Math"/>
+              </w:rPr>
+            </m:ctrlPr>
+          </m:sSubPr>
+          <m:e>
+            <m:r>
+              <w:rPr>
+                <w:rFonts w:ascii="Cambria Math" w:hAnsi="Cambria Math"/>
+              </w:rPr>
+              <m:t>K</m:t>
+            </m:r>
+          </m:e>
+          <m:sub>
+            <m:r>
+              <w:rPr>
+                <w:rFonts w:ascii="Cambria Math" w:hAnsi="Cambria Math"/>
+              </w:rPr>
+              <m:t>a</m:t>
+            </m:r>
+          </m:sub>
+        </m:sSub>
+        <m:r>
+          <w:rPr>
+            <w:rFonts w:ascii="Cambria Math" w:hAnsi="Cambria Math"/>
+          </w:rPr>
+          <m:t>=5</m:t>
+        </m:r>
+      </m:oMath>
+    </w:p>
+    <w:p>
+      <w:r>
+        <w:drawing>
+          <wp:inline distT="0" distB="0" distL="0" distR="0" wp14:anchorId="1D22B8D4" wp14:editId="58194BFF">
+            <wp:extent cx="4658375" cy="3734321"/>
+            <wp:effectExtent l="0" t="0" r="8890" b="0"/>
+            <wp:docPr id="2051972397" name="Picture 1"/>
+            <wp:cNvGraphicFramePr>
+              <a:graphicFrameLocks xmlns:a="http://schemas.openxmlformats.org/drawingml/2006/main" noChangeAspect="1"/>
+            </wp:cNvGraphicFramePr>
+            <a:graphic xmlns:a="http://schemas.openxmlformats.org/drawingml/2006/main">
+              <a:graphicData uri="http://schemas.openxmlformats.org/drawingml/2006/picture">
+                <pic:pic xmlns:pic="http://schemas.openxmlformats.org/drawingml/2006/picture">
+                  <pic:nvPicPr>
+                    <pic:cNvPr id="2051972397" name=""/>
+                    <pic:cNvPicPr/>
+                  </pic:nvPicPr>
+                  <pic:blipFill>
+                    <a:blip r:embed="rId10"/>
+                    <a:stretch>
+                      <a:fillRect/>
+                    </a:stretch>
+                  </pic:blipFill>
+                  <pic:spPr>
+                    <a:xfrm>
+                      <a:off x="0" y="0"/>
+                      <a:ext cx="4658375" cy="3734321"/>
+                    </a:xfrm>
+                    <a:prstGeom prst="rect">
+                      <a:avLst/>
+                    </a:prstGeom>
+                  </pic:spPr>
+                </pic:pic>
+              </a:graphicData>
+            </a:graphic>
+          </wp:inline>
+        </w:drawing>
+      </w:r>
+    </w:p>
+    <w:p>
+      <w:pPr>
+        <w:pStyle w:val="NormalWeb"/>
+      </w:pPr>
+      <w:r>
+        <w:t xml:space="preserve">For a reference speed of 140 rad/s, the system reaches a steady-state value close to the desired speed. When the disturbance torque is applied at </w:t>
+      </w:r>
+      <m:oMath>
+        <m:r>
+          <w:rPr>
+            <w:rFonts w:ascii="Cambria Math" w:hAnsi="Cambria Math"/>
+          </w:rPr>
+          <m:t>t=2</m:t>
+        </m:r>
+      </m:oMath>
+      <w:r>
+        <w:t>seconds, the speed experiences a small drop.</w:t>
+      </w:r>
+    </w:p>
+    <w:p>
+      <w:pPr>
+        <w:pStyle w:val="NormalWeb"/>
+      </w:pPr>
+      <w:r>
+        <w:t>Unlike the open-loop case, where the speed remains permanently reduced, the closed-loop system responds by increasing the input voltage to compensate for the disturbance. This results in the motor speed recovering and settling near the reference value.</w:t>
+      </w:r>
+    </w:p>
+    <w:p>
+      <w:pPr>
+        <w:pStyle w:val="NormalWeb"/>
+      </w:pPr>
+      <w:r>
+        <w:t>Although a small steady-state error remains, it is significantly smaller than in the open-loop system. This confirms that feedback control improves system robustness and reduces the impact of disturbances.</w:t>
+      </w:r>
+    </w:p>
+    <w:p>
+      <w:pPr>
+        <w:pStyle w:val="Heading3"/>
+      </w:pPr>
+      <w:r>
+        <w:rPr>
+          <w:rStyle w:val="Strong"/>
+          <w:b w:val="0"/>
+          <w:bCs w:val="0"/>
+        </w:rPr>
+        <w:t>Effect of Increasing Controller Gain</w:t>
+      </w:r>
+    </w:p>
+    <w:p>
+      <w:pPr>
+        <w:pStyle w:val="NormalWeb"/>
+      </w:pPr>
+      <w:r>
+        <w:t xml:space="preserve">To further evaluate system performance, the controller gain </w:t>
+      </w:r>
+      <m:oMath>
+        <m:sSub>
+          <m:sSubPr>
+            <m:ctrlPr>
+              <w:rPr>
+                <w:rFonts w:ascii="Cambria Math" w:hAnsi="Cambria Math"/>
+              </w:rPr>
+            </m:ctrlPr>
+          </m:sSubPr>
+          <m:e>
+            <m:r>
+              <w:rPr>
+                <w:rFonts w:ascii="Cambria Math" w:hAnsi="Cambria Math"/>
+              </w:rPr>
+              <m:t>K</m:t>
+            </m:r>
+          </m:e>
+          <m:sub>
+            <m:r>
+              <w:rPr>
+                <w:rFonts w:ascii="Cambria Math" w:hAnsi="Cambria Math"/>
+              </w:rPr>
+              <m:t>a</m:t>
+            </m:r>
+          </m:sub>
+        </m:sSub>
+      </m:oMath>
+      <w:r>
+        <w:t>was increased while maintaining a reference speed of 140 rad/s.</w:t>
+      </w:r>
+    </w:p>
+    <w:p>
+      <w:pPr>
+        <w:pStyle w:val="NormalWeb"/>
+      </w:pPr>
+      <w:r>
+        <w:lastRenderedPageBreak/>
+        <w:t xml:space="preserve">For </w:t>
+      </w:r>
+      <m:oMath>
+        <m:sSub>
+          <m:sSubPr>
+            <m:ctrlPr>
+              <w:rPr>
+                <w:rFonts w:ascii="Cambria Math" w:hAnsi="Cambria Math"/>
+              </w:rPr>
+            </m:ctrlPr>
+          </m:sSubPr>
+          <m:e>
+            <m:r>
+              <w:rPr>
+                <w:rFonts w:ascii="Cambria Math" w:hAnsi="Cambria Math"/>
+              </w:rPr>
+              <m:t>K</m:t>
+            </m:r>
+          </m:e>
+          <m:sub>
+            <m:r>
+              <w:rPr>
+                <w:rFonts w:ascii="Cambria Math" w:hAnsi="Cambria Math"/>
+              </w:rPr>
+              <m:t>a</m:t>
+            </m:r>
+          </m:sub>
+        </m:sSub>
+        <m:r>
+          <w:rPr>
+            <w:rFonts w:ascii="Cambria Math" w:hAnsi="Cambria Math"/>
+          </w:rPr>
+          <m:t>=40</m:t>
+        </m:r>
+      </m:oMath>
+      <w:r>
+        <w:t xml:space="preserve">, the system exhibited a noticeably smaller deviation in speed when the disturbance was applied. The transient response was faster, and the steady-state error was reduced compared to the </w:t>
+      </w:r>
+      <m:oMath>
+        <m:sSub>
+          <m:sSubPr>
+            <m:ctrlPr>
+              <w:rPr>
+                <w:rFonts w:ascii="Cambria Math" w:hAnsi="Cambria Math"/>
+              </w:rPr>
+            </m:ctrlPr>
+          </m:sSubPr>
+          <m:e>
+            <m:r>
+              <w:rPr>
+                <w:rFonts w:ascii="Cambria Math" w:hAnsi="Cambria Math"/>
+              </w:rPr>
+              <m:t>K</m:t>
+            </m:r>
+          </m:e>
+          <m:sub>
+            <m:r>
+              <w:rPr>
+                <w:rFonts w:ascii="Cambria Math" w:hAnsi="Cambria Math"/>
+              </w:rPr>
+              <m:t>a</m:t>
+            </m:r>
+          </m:sub>
+        </m:sSub>
+        <m:r>
+          <w:rPr>
+            <w:rFonts w:ascii="Cambria Math" w:hAnsi="Cambria Math"/>
+          </w:rPr>
+          <m:t>=5</m:t>
+        </m:r>
+      </m:oMath>
+      <w:r>
+        <w:t>case.</w:t>
+      </w:r>
+    </w:p>
+    <w:p>
+      <w:pPr>
+        <w:pStyle w:val="NormalWeb"/>
+      </w:pPr>
+      <w:r>
+        <w:t xml:space="preserve">For </w:t>
+      </w:r>
+      <m:oMath>
+        <m:sSub>
+          <m:sSubPr>
+            <m:ctrlPr>
+              <w:rPr>
+                <w:rFonts w:ascii="Cambria Math" w:hAnsi="Cambria Math"/>
+              </w:rPr>
+            </m:ctrlPr>
+          </m:sSubPr>
+          <m:e>
+            <m:r>
+              <w:rPr>
+                <w:rFonts w:ascii="Cambria Math" w:hAnsi="Cambria Math"/>
+              </w:rPr>
+              <m:t>K</m:t>
+            </m:r>
+          </m:e>
+          <m:sub>
+            <m:r>
+              <w:rPr>
+                <w:rFonts w:ascii="Cambria Math" w:hAnsi="Cambria Math"/>
+              </w:rPr>
+              <m:t>a</m:t>
+            </m:r>
+          </m:sub>
+        </m:sSub>
+        <m:r>
+          <w:rPr>
+            <w:rFonts w:ascii="Cambria Math" w:hAnsi="Cambria Math"/>
+          </w:rPr>
+          <m:t>=100</m:t>
+        </m:r>
+      </m:oMath>
+      <w:r>
+        <w:t>, the disturbance effect became minimal. The motor speed showed only a very small deviation from the reference and quickly returned to the desired value. The steady-state error was nearly eliminated.</w:t>
+      </w:r>
+    </w:p>
+    <w:p>
+      <w:pPr>
+        <w:pStyle w:val="NormalWeb"/>
+      </w:pPr>
+      <w:r>
+        <w:t>These results indicate that increasing the controller gain improves disturbance rejection and enhances the system’s ability to maintain the reference speed. This occurs because higher gain increases the corrective action applied in response to error.</w:t>
+      </w:r>
+    </w:p>
+    <w:p>
+      <w:pPr>
+        <w:pStyle w:val="Heading3"/>
+      </w:pPr>
+      <w:r>
+        <w:rPr>
+          <w:rStyle w:val="Strong"/>
+          <w:b w:val="0"/>
+          <w:bCs w:val="0"/>
+        </w:rPr>
         <w:t>Comparison and Interpretation</w:t>
       </w:r>
     </w:p>
@@ -4270,6 +5436,20 @@
         <w:rPr>
           <w:rFonts w:asciiTheme="minorHAnsi" w:hAnsiTheme="minorHAnsi"/>
         </w:rPr>
+        <w:t>The closed-loop system demonstrates a significant improvement in performance compared to the open-loop configuration. In the open-loop system, disturbances directly affect the output, resulting in a permanent reduction in motor speed. In contrast, the closed-loop system continuously monitors the output and adjusts the input to counteract disturbances.</w:t>
+      </w:r>
+    </w:p>
+    <w:p>
+      <w:pPr>
+        <w:pStyle w:val="NormalWeb"/>
+        <w:rPr>
+          <w:rFonts w:asciiTheme="minorHAnsi" w:hAnsiTheme="minorHAnsi"/>
+        </w:rPr>
+      </w:pPr>
+      <w:r>
+        <w:rPr>
+          <w:rFonts w:asciiTheme="minorHAnsi" w:hAnsiTheme="minorHAnsi"/>
+        </w:rPr>
         <w:t>A direct comparison between open-loop and closed-loop performance highlights the advantages of feedback control. In the open-loop system, disturbances caused a permanent reduction in motor speed, regardless of input voltage. In contrast, the closed-loop system actively corrected for disturbances and maintained the desired speed.</w:t>
       </w:r>
     </w:p>
@@ -4303,13 +5483,6 @@
     </w:p>
     <w:p>
       <w:pPr>
-        <w:pStyle w:val="NormalWeb"/>
-      </w:pPr>
-    </w:p>
-    <w:p/>
-    <w:p/>
-    <w:p>
-      <w:pPr>
         <w:pStyle w:val="Heading1"/>
       </w:pPr>
       <w:bookmarkStart w:id="4" w:name="_Toc226495283"/>
@@ -4325,7 +5498,11 @@
     </w:p>
     <w:p>
       <w:r>
-        <w:t>In contrast, the closed-loop system significantly improved performance by reducing the effect of disturbances and minimizing steady-state error. Increasing the controller gain further enhanced disturbance rejection, allowing the system to maintain the desired speed even in the presence of external loads.</w:t>
+        <w:t xml:space="preserve">In contrast, the closed-loop system significantly improved performance by reducing the effect of disturbances and minimizing steady-state error. Increasing the controller gain </w:t>
+      </w:r>
+      <w:r>
+        <w:lastRenderedPageBreak/>
+        <w:t>further enhanced disturbance rejection, allowing the system to maintain the desired speed even in the presence of external loads.</w:t>
       </w:r>
     </w:p>
     <w:p>
@@ -4427,29 +5604,7 @@
                 <w:szCs w:val="20"/>
                 <w14:ligatures w14:val="none"/>
               </w:rPr>
-              <w:t xml:space="preserve">p = </w:t>
-            </w:r>
-            <w:proofErr w:type="gramStart"/>
-            <w:r>
-              <w:rPr>
-                <w:rFonts w:ascii="Consolas" w:eastAsia="Times New Roman" w:hAnsi="Consolas" w:cs="Times New Roman"/>
-                <w:kern w:val="0"/>
-                <w:sz w:val="20"/>
-                <w:szCs w:val="20"/>
-                <w14:ligatures w14:val="none"/>
-              </w:rPr>
-              <w:t>params(</w:t>
-            </w:r>
-            <w:proofErr w:type="gramEnd"/>
-            <w:r>
-              <w:rPr>
-                <w:rFonts w:ascii="Consolas" w:eastAsia="Times New Roman" w:hAnsi="Consolas" w:cs="Times New Roman"/>
-                <w:kern w:val="0"/>
-                <w:sz w:val="20"/>
-                <w:szCs w:val="20"/>
-                <w14:ligatures w14:val="none"/>
-              </w:rPr>
-              <w:t>)</w:t>
+              <w:t>p = params()</w:t>
             </w:r>
           </w:p>
           <w:p>
@@ -4470,20 +5625,8 @@
                 <w:szCs w:val="20"/>
                 <w14:ligatures w14:val="none"/>
               </w:rPr>
-              <w:t xml:space="preserve">p = </w:t>
-            </w:r>
-            <w:proofErr w:type="gramStart"/>
-            <w:r>
-              <w:rPr>
-                <w:rFonts w:ascii="Consolas" w:eastAsia="Times New Roman" w:hAnsi="Consolas" w:cs="Times New Roman"/>
-                <w:kern w:val="0"/>
-                <w:sz w:val="20"/>
-                <w:szCs w:val="20"/>
-                <w14:ligatures w14:val="none"/>
-              </w:rPr>
-              <w:t>struct();</w:t>
-            </w:r>
-            <w:proofErr w:type="gramEnd"/>
+              <w:t>p = struct();</w:t>
+            </w:r>
           </w:p>
           <w:p>
             <w:pPr>
@@ -4528,42 +5671,16 @@
                 <w14:ligatures w14:val="none"/>
               </w:rPr>
             </w:pPr>
-            <w:proofErr w:type="spellStart"/>
-            <w:proofErr w:type="gramStart"/>
-            <w:r>
-              <w:rPr>
-                <w:rFonts w:ascii="Consolas" w:eastAsia="Times New Roman" w:hAnsi="Consolas" w:cs="Times New Roman"/>
-                <w:kern w:val="0"/>
-                <w:sz w:val="20"/>
-                <w:szCs w:val="20"/>
-                <w14:ligatures w14:val="none"/>
-              </w:rPr>
-              <w:t>p.Kb</w:t>
-            </w:r>
-            <w:proofErr w:type="spellEnd"/>
-            <w:proofErr w:type="gramEnd"/>
-            <w:r>
-              <w:rPr>
-                <w:rFonts w:ascii="Consolas" w:eastAsia="Times New Roman" w:hAnsi="Consolas" w:cs="Times New Roman"/>
-                <w:kern w:val="0"/>
-                <w:sz w:val="20"/>
-                <w:szCs w:val="20"/>
-                <w14:ligatures w14:val="none"/>
-              </w:rPr>
-              <w:t xml:space="preserve"> = </w:t>
-            </w:r>
-            <w:proofErr w:type="gramStart"/>
-            <w:r>
-              <w:rPr>
-                <w:rFonts w:ascii="Consolas" w:eastAsia="Times New Roman" w:hAnsi="Consolas" w:cs="Times New Roman"/>
-                <w:kern w:val="0"/>
-                <w:sz w:val="20"/>
-                <w:szCs w:val="20"/>
-                <w14:ligatures w14:val="none"/>
-              </w:rPr>
-              <w:t>0.0772;</w:t>
-            </w:r>
-            <w:proofErr w:type="gramEnd"/>
+            <w:r>
+              <w:rPr>
+                <w:rFonts w:ascii="Consolas" w:eastAsia="Times New Roman" w:hAnsi="Consolas" w:cs="Times New Roman"/>
+                <w:kern w:val="0"/>
+                <w:sz w:val="20"/>
+                <w:szCs w:val="20"/>
+                <w14:ligatures w14:val="none"/>
+              </w:rPr>
+              <w:t>p.Kb = 0.0772;</w:t>
+            </w:r>
           </w:p>
           <w:p>
             <w:pPr>
@@ -4575,42 +5692,16 @@
                 <w14:ligatures w14:val="none"/>
               </w:rPr>
             </w:pPr>
-            <w:proofErr w:type="spellStart"/>
-            <w:proofErr w:type="gramStart"/>
-            <w:r>
-              <w:rPr>
-                <w:rFonts w:ascii="Consolas" w:eastAsia="Times New Roman" w:hAnsi="Consolas" w:cs="Times New Roman"/>
-                <w:kern w:val="0"/>
-                <w:sz w:val="20"/>
-                <w:szCs w:val="20"/>
-                <w14:ligatures w14:val="none"/>
-              </w:rPr>
-              <w:t>p.Ki</w:t>
-            </w:r>
-            <w:proofErr w:type="spellEnd"/>
-            <w:proofErr w:type="gramEnd"/>
-            <w:r>
-              <w:rPr>
-                <w:rFonts w:ascii="Consolas" w:eastAsia="Times New Roman" w:hAnsi="Consolas" w:cs="Times New Roman"/>
-                <w:kern w:val="0"/>
-                <w:sz w:val="20"/>
-                <w:szCs w:val="20"/>
-                <w14:ligatures w14:val="none"/>
-              </w:rPr>
-              <w:t xml:space="preserve"> = </w:t>
-            </w:r>
-            <w:proofErr w:type="gramStart"/>
-            <w:r>
-              <w:rPr>
-                <w:rFonts w:ascii="Consolas" w:eastAsia="Times New Roman" w:hAnsi="Consolas" w:cs="Times New Roman"/>
-                <w:kern w:val="0"/>
-                <w:sz w:val="20"/>
-                <w:szCs w:val="20"/>
-                <w14:ligatures w14:val="none"/>
-              </w:rPr>
-              <w:t>0.067;</w:t>
-            </w:r>
-            <w:proofErr w:type="gramEnd"/>
+            <w:r>
+              <w:rPr>
+                <w:rFonts w:ascii="Consolas" w:eastAsia="Times New Roman" w:hAnsi="Consolas" w:cs="Times New Roman"/>
+                <w:kern w:val="0"/>
+                <w:sz w:val="20"/>
+                <w:szCs w:val="20"/>
+                <w14:ligatures w14:val="none"/>
+              </w:rPr>
+              <w:t>p.Ki = 0.067;</w:t>
+            </w:r>
           </w:p>
           <w:p>
             <w:pPr>
@@ -4622,42 +5713,16 @@
                 <w14:ligatures w14:val="none"/>
               </w:rPr>
             </w:pPr>
-            <w:proofErr w:type="spellStart"/>
-            <w:proofErr w:type="gramStart"/>
-            <w:r>
-              <w:rPr>
-                <w:rFonts w:ascii="Consolas" w:eastAsia="Times New Roman" w:hAnsi="Consolas" w:cs="Times New Roman"/>
-                <w:kern w:val="0"/>
-                <w:sz w:val="20"/>
-                <w:szCs w:val="20"/>
-                <w14:ligatures w14:val="none"/>
-              </w:rPr>
-              <w:t>p.Ra</w:t>
-            </w:r>
-            <w:proofErr w:type="spellEnd"/>
-            <w:proofErr w:type="gramEnd"/>
-            <w:r>
-              <w:rPr>
-                <w:rFonts w:ascii="Consolas" w:eastAsia="Times New Roman" w:hAnsi="Consolas" w:cs="Times New Roman"/>
-                <w:kern w:val="0"/>
-                <w:sz w:val="20"/>
-                <w:szCs w:val="20"/>
-                <w14:ligatures w14:val="none"/>
-              </w:rPr>
-              <w:t xml:space="preserve"> = </w:t>
-            </w:r>
-            <w:proofErr w:type="gramStart"/>
-            <w:r>
-              <w:rPr>
-                <w:rFonts w:ascii="Consolas" w:eastAsia="Times New Roman" w:hAnsi="Consolas" w:cs="Times New Roman"/>
-                <w:kern w:val="0"/>
-                <w:sz w:val="20"/>
-                <w:szCs w:val="20"/>
-                <w14:ligatures w14:val="none"/>
-              </w:rPr>
-              <w:t>0.7454;</w:t>
-            </w:r>
-            <w:proofErr w:type="gramEnd"/>
+            <w:r>
+              <w:rPr>
+                <w:rFonts w:ascii="Consolas" w:eastAsia="Times New Roman" w:hAnsi="Consolas" w:cs="Times New Roman"/>
+                <w:kern w:val="0"/>
+                <w:sz w:val="20"/>
+                <w:szCs w:val="20"/>
+                <w14:ligatures w14:val="none"/>
+              </w:rPr>
+              <w:t>p.Ra = 0.7454;</w:t>
+            </w:r>
           </w:p>
           <w:p>
             <w:pPr>
@@ -4669,42 +5734,16 @@
                 <w14:ligatures w14:val="none"/>
               </w:rPr>
             </w:pPr>
-            <w:proofErr w:type="spellStart"/>
-            <w:proofErr w:type="gramStart"/>
-            <w:r>
-              <w:rPr>
-                <w:rFonts w:ascii="Consolas" w:eastAsia="Times New Roman" w:hAnsi="Consolas" w:cs="Times New Roman"/>
-                <w:kern w:val="0"/>
-                <w:sz w:val="20"/>
-                <w:szCs w:val="20"/>
-                <w14:ligatures w14:val="none"/>
-              </w:rPr>
-              <w:t>p.La</w:t>
-            </w:r>
-            <w:proofErr w:type="spellEnd"/>
-            <w:proofErr w:type="gramEnd"/>
-            <w:r>
-              <w:rPr>
-                <w:rFonts w:ascii="Consolas" w:eastAsia="Times New Roman" w:hAnsi="Consolas" w:cs="Times New Roman"/>
-                <w:kern w:val="0"/>
-                <w:sz w:val="20"/>
-                <w:szCs w:val="20"/>
-                <w14:ligatures w14:val="none"/>
-              </w:rPr>
-              <w:t xml:space="preserve"> = 4.8e-</w:t>
-            </w:r>
-            <w:proofErr w:type="gramStart"/>
-            <w:r>
-              <w:rPr>
-                <w:rFonts w:ascii="Consolas" w:eastAsia="Times New Roman" w:hAnsi="Consolas" w:cs="Times New Roman"/>
-                <w:kern w:val="0"/>
-                <w:sz w:val="20"/>
-                <w:szCs w:val="20"/>
-                <w14:ligatures w14:val="none"/>
-              </w:rPr>
-              <w:t>3;</w:t>
-            </w:r>
-            <w:proofErr w:type="gramEnd"/>
+            <w:r>
+              <w:rPr>
+                <w:rFonts w:ascii="Consolas" w:eastAsia="Times New Roman" w:hAnsi="Consolas" w:cs="Times New Roman"/>
+                <w:kern w:val="0"/>
+                <w:sz w:val="20"/>
+                <w:szCs w:val="20"/>
+                <w14:ligatures w14:val="none"/>
+              </w:rPr>
+              <w:t>p.La = 4.8e-3;</w:t>
+            </w:r>
           </w:p>
           <w:p>
             <w:pPr>
@@ -4716,42 +5755,16 @@
                 <w14:ligatures w14:val="none"/>
               </w:rPr>
             </w:pPr>
-            <w:proofErr w:type="spellStart"/>
-            <w:proofErr w:type="gramStart"/>
-            <w:r>
-              <w:rPr>
-                <w:rFonts w:ascii="Consolas" w:eastAsia="Times New Roman" w:hAnsi="Consolas" w:cs="Times New Roman"/>
-                <w:kern w:val="0"/>
-                <w:sz w:val="20"/>
-                <w:szCs w:val="20"/>
-                <w14:ligatures w14:val="none"/>
-              </w:rPr>
-              <w:t>p.Jm</w:t>
-            </w:r>
-            <w:proofErr w:type="spellEnd"/>
-            <w:proofErr w:type="gramEnd"/>
-            <w:r>
-              <w:rPr>
-                <w:rFonts w:ascii="Consolas" w:eastAsia="Times New Roman" w:hAnsi="Consolas" w:cs="Times New Roman"/>
-                <w:kern w:val="0"/>
-                <w:sz w:val="20"/>
-                <w:szCs w:val="20"/>
-                <w14:ligatures w14:val="none"/>
-              </w:rPr>
-              <w:t xml:space="preserve"> = 6.87e-</w:t>
-            </w:r>
-            <w:proofErr w:type="gramStart"/>
-            <w:r>
-              <w:rPr>
-                <w:rFonts w:ascii="Consolas" w:eastAsia="Times New Roman" w:hAnsi="Consolas" w:cs="Times New Roman"/>
-                <w:kern w:val="0"/>
-                <w:sz w:val="20"/>
-                <w:szCs w:val="20"/>
-                <w14:ligatures w14:val="none"/>
-              </w:rPr>
-              <w:t>5;</w:t>
-            </w:r>
-            <w:proofErr w:type="gramEnd"/>
+            <w:r>
+              <w:rPr>
+                <w:rFonts w:ascii="Consolas" w:eastAsia="Times New Roman" w:hAnsi="Consolas" w:cs="Times New Roman"/>
+                <w:kern w:val="0"/>
+                <w:sz w:val="20"/>
+                <w:szCs w:val="20"/>
+                <w14:ligatures w14:val="none"/>
+              </w:rPr>
+              <w:t>p.Jm = 6.87e-5;</w:t>
+            </w:r>
           </w:p>
           <w:p>
             <w:pPr>
@@ -4763,42 +5776,16 @@
                 <w14:ligatures w14:val="none"/>
               </w:rPr>
             </w:pPr>
-            <w:proofErr w:type="spellStart"/>
-            <w:proofErr w:type="gramStart"/>
-            <w:r>
-              <w:rPr>
-                <w:rFonts w:ascii="Consolas" w:eastAsia="Times New Roman" w:hAnsi="Consolas" w:cs="Times New Roman"/>
-                <w:kern w:val="0"/>
-                <w:sz w:val="20"/>
-                <w:szCs w:val="20"/>
-                <w14:ligatures w14:val="none"/>
-              </w:rPr>
-              <w:t>p.Bm</w:t>
-            </w:r>
-            <w:proofErr w:type="spellEnd"/>
-            <w:proofErr w:type="gramEnd"/>
-            <w:r>
-              <w:rPr>
-                <w:rFonts w:ascii="Consolas" w:eastAsia="Times New Roman" w:hAnsi="Consolas" w:cs="Times New Roman"/>
-                <w:kern w:val="0"/>
-                <w:sz w:val="20"/>
-                <w:szCs w:val="20"/>
-                <w14:ligatures w14:val="none"/>
-              </w:rPr>
-              <w:t xml:space="preserve"> = </w:t>
-            </w:r>
-            <w:proofErr w:type="gramStart"/>
-            <w:r>
-              <w:rPr>
-                <w:rFonts w:ascii="Consolas" w:eastAsia="Times New Roman" w:hAnsi="Consolas" w:cs="Times New Roman"/>
-                <w:kern w:val="0"/>
-                <w:sz w:val="20"/>
-                <w:szCs w:val="20"/>
-                <w14:ligatures w14:val="none"/>
-              </w:rPr>
-              <w:t>0.0003;</w:t>
-            </w:r>
-            <w:proofErr w:type="gramEnd"/>
+            <w:r>
+              <w:rPr>
+                <w:rFonts w:ascii="Consolas" w:eastAsia="Times New Roman" w:hAnsi="Consolas" w:cs="Times New Roman"/>
+                <w:kern w:val="0"/>
+                <w:sz w:val="20"/>
+                <w:szCs w:val="20"/>
+                <w14:ligatures w14:val="none"/>
+              </w:rPr>
+              <w:t>p.Bm = 0.0003;</w:t>
+            </w:r>
           </w:p>
           <w:p>
             <w:pPr>
@@ -4843,42 +5830,16 @@
                 <w14:ligatures w14:val="none"/>
               </w:rPr>
             </w:pPr>
-            <w:proofErr w:type="spellStart"/>
-            <w:proofErr w:type="gramStart"/>
-            <w:r>
-              <w:rPr>
-                <w:rFonts w:ascii="Consolas" w:eastAsia="Times New Roman" w:hAnsi="Consolas" w:cs="Times New Roman"/>
-                <w:kern w:val="0"/>
-                <w:sz w:val="20"/>
-                <w:szCs w:val="20"/>
-                <w14:ligatures w14:val="none"/>
-              </w:rPr>
-              <w:t>p.Ks</w:t>
-            </w:r>
-            <w:proofErr w:type="spellEnd"/>
-            <w:proofErr w:type="gramEnd"/>
-            <w:r>
-              <w:rPr>
-                <w:rFonts w:ascii="Consolas" w:eastAsia="Times New Roman" w:hAnsi="Consolas" w:cs="Times New Roman"/>
-                <w:kern w:val="0"/>
-                <w:sz w:val="20"/>
-                <w:szCs w:val="20"/>
-                <w14:ligatures w14:val="none"/>
-              </w:rPr>
-              <w:t xml:space="preserve"> = </w:t>
-            </w:r>
-            <w:proofErr w:type="gramStart"/>
-            <w:r>
-              <w:rPr>
-                <w:rFonts w:ascii="Consolas" w:eastAsia="Times New Roman" w:hAnsi="Consolas" w:cs="Times New Roman"/>
-                <w:kern w:val="0"/>
-                <w:sz w:val="20"/>
-                <w:szCs w:val="20"/>
-                <w14:ligatures w14:val="none"/>
-              </w:rPr>
-              <w:t>1;</w:t>
-            </w:r>
-            <w:proofErr w:type="gramEnd"/>
+            <w:r>
+              <w:rPr>
+                <w:rFonts w:ascii="Consolas" w:eastAsia="Times New Roman" w:hAnsi="Consolas" w:cs="Times New Roman"/>
+                <w:kern w:val="0"/>
+                <w:sz w:val="20"/>
+                <w:szCs w:val="20"/>
+                <w14:ligatures w14:val="none"/>
+              </w:rPr>
+              <w:t>p.Ks = 1;</w:t>
+            </w:r>
           </w:p>
           <w:p>
             <w:pPr>
@@ -4890,42 +5851,16 @@
                 <w14:ligatures w14:val="none"/>
               </w:rPr>
             </w:pPr>
-            <w:proofErr w:type="spellStart"/>
-            <w:proofErr w:type="gramStart"/>
-            <w:r>
-              <w:rPr>
-                <w:rFonts w:ascii="Consolas" w:eastAsia="Times New Roman" w:hAnsi="Consolas" w:cs="Times New Roman"/>
-                <w:kern w:val="0"/>
-                <w:sz w:val="20"/>
-                <w:szCs w:val="20"/>
-                <w14:ligatures w14:val="none"/>
-              </w:rPr>
-              <w:t>p.Ka</w:t>
-            </w:r>
-            <w:proofErr w:type="spellEnd"/>
-            <w:proofErr w:type="gramEnd"/>
-            <w:r>
-              <w:rPr>
-                <w:rFonts w:ascii="Consolas" w:eastAsia="Times New Roman" w:hAnsi="Consolas" w:cs="Times New Roman"/>
-                <w:kern w:val="0"/>
-                <w:sz w:val="20"/>
-                <w:szCs w:val="20"/>
-                <w14:ligatures w14:val="none"/>
-              </w:rPr>
-              <w:t xml:space="preserve"> = </w:t>
-            </w:r>
-            <w:proofErr w:type="gramStart"/>
-            <w:r>
-              <w:rPr>
-                <w:rFonts w:ascii="Consolas" w:eastAsia="Times New Roman" w:hAnsi="Consolas" w:cs="Times New Roman"/>
-                <w:kern w:val="0"/>
-                <w:sz w:val="20"/>
-                <w:szCs w:val="20"/>
-                <w14:ligatures w14:val="none"/>
-              </w:rPr>
-              <w:t>5;</w:t>
-            </w:r>
-            <w:proofErr w:type="gramEnd"/>
+            <w:r>
+              <w:rPr>
+                <w:rFonts w:ascii="Consolas" w:eastAsia="Times New Roman" w:hAnsi="Consolas" w:cs="Times New Roman"/>
+                <w:kern w:val="0"/>
+                <w:sz w:val="20"/>
+                <w:szCs w:val="20"/>
+                <w14:ligatures w14:val="none"/>
+              </w:rPr>
+              <w:t>p.Ka = 5;</w:t>
+            </w:r>
           </w:p>
           <w:p>
             <w:pPr>
@@ -4970,40 +5905,16 @@
                 <w14:ligatures w14:val="none"/>
               </w:rPr>
             </w:pPr>
-            <w:proofErr w:type="spellStart"/>
-            <w:r>
-              <w:rPr>
-                <w:rFonts w:ascii="Consolas" w:eastAsia="Times New Roman" w:hAnsi="Consolas" w:cs="Times New Roman"/>
-                <w:kern w:val="0"/>
-                <w:sz w:val="20"/>
-                <w:szCs w:val="20"/>
-                <w14:ligatures w14:val="none"/>
-              </w:rPr>
-              <w:t>p.TL_step</w:t>
-            </w:r>
-            <w:proofErr w:type="spellEnd"/>
-            <w:r>
-              <w:rPr>
-                <w:rFonts w:ascii="Consolas" w:eastAsia="Times New Roman" w:hAnsi="Consolas" w:cs="Times New Roman"/>
-                <w:kern w:val="0"/>
-                <w:sz w:val="20"/>
-                <w:szCs w:val="20"/>
-                <w14:ligatures w14:val="none"/>
-              </w:rPr>
-              <w:t xml:space="preserve"> = </w:t>
-            </w:r>
-            <w:proofErr w:type="gramStart"/>
-            <w:r>
-              <w:rPr>
-                <w:rFonts w:ascii="Consolas" w:eastAsia="Times New Roman" w:hAnsi="Consolas" w:cs="Times New Roman"/>
-                <w:kern w:val="0"/>
-                <w:sz w:val="20"/>
-                <w:szCs w:val="20"/>
-                <w14:ligatures w14:val="none"/>
-              </w:rPr>
-              <w:t>0.1;</w:t>
-            </w:r>
-            <w:proofErr w:type="gramEnd"/>
+            <w:r>
+              <w:rPr>
+                <w:rFonts w:ascii="Consolas" w:eastAsia="Times New Roman" w:hAnsi="Consolas" w:cs="Times New Roman"/>
+                <w:kern w:val="0"/>
+                <w:sz w:val="20"/>
+                <w:szCs w:val="20"/>
+                <w14:ligatures w14:val="none"/>
+              </w:rPr>
+              <w:t>p.TL_step = 0.1;</w:t>
+            </w:r>
           </w:p>
           <w:p>
             <w:pPr>
@@ -5015,42 +5926,16 @@
                 <w14:ligatures w14:val="none"/>
               </w:rPr>
             </w:pPr>
-            <w:proofErr w:type="spellStart"/>
-            <w:proofErr w:type="gramStart"/>
-            <w:r>
-              <w:rPr>
-                <w:rFonts w:ascii="Consolas" w:eastAsia="Times New Roman" w:hAnsi="Consolas" w:cs="Times New Roman"/>
-                <w:kern w:val="0"/>
-                <w:sz w:val="20"/>
-                <w:szCs w:val="20"/>
-                <w14:ligatures w14:val="none"/>
-              </w:rPr>
-              <w:t>p.Td</w:t>
-            </w:r>
-            <w:proofErr w:type="spellEnd"/>
-            <w:proofErr w:type="gramEnd"/>
-            <w:r>
-              <w:rPr>
-                <w:rFonts w:ascii="Consolas" w:eastAsia="Times New Roman" w:hAnsi="Consolas" w:cs="Times New Roman"/>
-                <w:kern w:val="0"/>
-                <w:sz w:val="20"/>
-                <w:szCs w:val="20"/>
-                <w14:ligatures w14:val="none"/>
-              </w:rPr>
-              <w:t xml:space="preserve"> = </w:t>
-            </w:r>
-            <w:proofErr w:type="gramStart"/>
-            <w:r>
-              <w:rPr>
-                <w:rFonts w:ascii="Consolas" w:eastAsia="Times New Roman" w:hAnsi="Consolas" w:cs="Times New Roman"/>
-                <w:kern w:val="0"/>
-                <w:sz w:val="20"/>
-                <w:szCs w:val="20"/>
-                <w14:ligatures w14:val="none"/>
-              </w:rPr>
-              <w:t>2;</w:t>
-            </w:r>
-            <w:proofErr w:type="gramEnd"/>
+            <w:r>
+              <w:rPr>
+                <w:rFonts w:ascii="Consolas" w:eastAsia="Times New Roman" w:hAnsi="Consolas" w:cs="Times New Roman"/>
+                <w:kern w:val="0"/>
+                <w:sz w:val="20"/>
+                <w:szCs w:val="20"/>
+                <w14:ligatures w14:val="none"/>
+              </w:rPr>
+              <w:t>p.Td = 2;</w:t>
+            </w:r>
           </w:p>
           <w:p>
             <w:pPr>
@@ -5095,43 +5980,16 @@
                 <w14:ligatures w14:val="none"/>
               </w:rPr>
             </w:pPr>
-            <w:proofErr w:type="spellStart"/>
-            <w:proofErr w:type="gramStart"/>
-            <w:r>
-              <w:rPr>
-                <w:rFonts w:ascii="Consolas" w:eastAsia="Times New Roman" w:hAnsi="Consolas" w:cs="Times New Roman"/>
-                <w:kern w:val="0"/>
-                <w:sz w:val="20"/>
-                <w:szCs w:val="20"/>
-                <w14:ligatures w14:val="none"/>
-              </w:rPr>
-              <w:lastRenderedPageBreak/>
-              <w:t>p.Ea</w:t>
-            </w:r>
-            <w:proofErr w:type="spellEnd"/>
-            <w:proofErr w:type="gramEnd"/>
-            <w:r>
-              <w:rPr>
-                <w:rFonts w:ascii="Consolas" w:eastAsia="Times New Roman" w:hAnsi="Consolas" w:cs="Times New Roman"/>
-                <w:kern w:val="0"/>
-                <w:sz w:val="20"/>
-                <w:szCs w:val="20"/>
-                <w14:ligatures w14:val="none"/>
-              </w:rPr>
-              <w:t xml:space="preserve"> = </w:t>
-            </w:r>
-            <w:proofErr w:type="gramStart"/>
-            <w:r>
-              <w:rPr>
-                <w:rFonts w:ascii="Consolas" w:eastAsia="Times New Roman" w:hAnsi="Consolas" w:cs="Times New Roman"/>
-                <w:kern w:val="0"/>
-                <w:sz w:val="20"/>
-                <w:szCs w:val="20"/>
-                <w14:ligatures w14:val="none"/>
-              </w:rPr>
-              <w:t>10;</w:t>
-            </w:r>
-            <w:proofErr w:type="gramEnd"/>
+            <w:r>
+              <w:rPr>
+                <w:rFonts w:ascii="Consolas" w:eastAsia="Times New Roman" w:hAnsi="Consolas" w:cs="Times New Roman"/>
+                <w:kern w:val="0"/>
+                <w:sz w:val="20"/>
+                <w:szCs w:val="20"/>
+                <w14:ligatures w14:val="none"/>
+              </w:rPr>
+              <w:t>p.Ea = 10;</w:t>
+            </w:r>
           </w:p>
           <w:p>
             <w:pPr>
@@ -5143,52 +6001,16 @@
                 <w14:ligatures w14:val="none"/>
               </w:rPr>
             </w:pPr>
-            <w:proofErr w:type="spellStart"/>
-            <w:proofErr w:type="gramStart"/>
-            <w:r>
-              <w:rPr>
-                <w:rFonts w:ascii="Consolas" w:eastAsia="Times New Roman" w:hAnsi="Consolas" w:cs="Times New Roman"/>
-                <w:kern w:val="0"/>
-                <w:sz w:val="20"/>
-                <w:szCs w:val="20"/>
-                <w14:ligatures w14:val="none"/>
-              </w:rPr>
-              <w:t>p.wm</w:t>
-            </w:r>
-            <w:proofErr w:type="gramEnd"/>
-            <w:r>
-              <w:rPr>
-                <w:rFonts w:ascii="Consolas" w:eastAsia="Times New Roman" w:hAnsi="Consolas" w:cs="Times New Roman"/>
-                <w:kern w:val="0"/>
-                <w:sz w:val="20"/>
-                <w:szCs w:val="20"/>
-                <w14:ligatures w14:val="none"/>
-              </w:rPr>
-              <w:t>_ref</w:t>
-            </w:r>
-            <w:proofErr w:type="spellEnd"/>
-            <w:r>
-              <w:rPr>
-                <w:rFonts w:ascii="Consolas" w:eastAsia="Times New Roman" w:hAnsi="Consolas" w:cs="Times New Roman"/>
-                <w:kern w:val="0"/>
-                <w:sz w:val="20"/>
-                <w:szCs w:val="20"/>
-                <w14:ligatures w14:val="none"/>
-              </w:rPr>
-              <w:t xml:space="preserve"> = </w:t>
-            </w:r>
-            <w:proofErr w:type="gramStart"/>
-            <w:r>
-              <w:rPr>
-                <w:rFonts w:ascii="Consolas" w:eastAsia="Times New Roman" w:hAnsi="Consolas" w:cs="Times New Roman"/>
-                <w:kern w:val="0"/>
-                <w:sz w:val="20"/>
-                <w:szCs w:val="20"/>
-                <w14:ligatures w14:val="none"/>
-              </w:rPr>
-              <w:t>140;</w:t>
-            </w:r>
-            <w:proofErr w:type="gramEnd"/>
+            <w:r>
+              <w:rPr>
+                <w:rFonts w:ascii="Consolas" w:eastAsia="Times New Roman" w:hAnsi="Consolas" w:cs="Times New Roman"/>
+                <w:kern w:val="0"/>
+                <w:sz w:val="20"/>
+                <w:szCs w:val="20"/>
+                <w14:ligatures w14:val="none"/>
+              </w:rPr>
+              <w:t>p.wm_ref = 140;</w:t>
+            </w:r>
           </w:p>
           <w:p>
             <w:pPr>
@@ -5233,42 +6055,16 @@
                 <w14:ligatures w14:val="none"/>
               </w:rPr>
             </w:pPr>
-            <w:proofErr w:type="spellStart"/>
-            <w:proofErr w:type="gramStart"/>
-            <w:r>
-              <w:rPr>
-                <w:rFonts w:ascii="Consolas" w:eastAsia="Times New Roman" w:hAnsi="Consolas" w:cs="Times New Roman"/>
-                <w:kern w:val="0"/>
-                <w:sz w:val="20"/>
-                <w:szCs w:val="20"/>
-                <w14:ligatures w14:val="none"/>
-              </w:rPr>
-              <w:t>p.tstop</w:t>
-            </w:r>
-            <w:proofErr w:type="spellEnd"/>
-            <w:proofErr w:type="gramEnd"/>
-            <w:r>
-              <w:rPr>
-                <w:rFonts w:ascii="Consolas" w:eastAsia="Times New Roman" w:hAnsi="Consolas" w:cs="Times New Roman"/>
-                <w:kern w:val="0"/>
-                <w:sz w:val="20"/>
-                <w:szCs w:val="20"/>
-                <w14:ligatures w14:val="none"/>
-              </w:rPr>
-              <w:t xml:space="preserve"> = </w:t>
-            </w:r>
-            <w:proofErr w:type="gramStart"/>
-            <w:r>
-              <w:rPr>
-                <w:rFonts w:ascii="Consolas" w:eastAsia="Times New Roman" w:hAnsi="Consolas" w:cs="Times New Roman"/>
-                <w:kern w:val="0"/>
-                <w:sz w:val="20"/>
-                <w:szCs w:val="20"/>
-                <w14:ligatures w14:val="none"/>
-              </w:rPr>
-              <w:t>6;</w:t>
-            </w:r>
-            <w:proofErr w:type="gramEnd"/>
+            <w:r>
+              <w:rPr>
+                <w:rFonts w:ascii="Consolas" w:eastAsia="Times New Roman" w:hAnsi="Consolas" w:cs="Times New Roman"/>
+                <w:kern w:val="0"/>
+                <w:sz w:val="20"/>
+                <w:szCs w:val="20"/>
+                <w14:ligatures w14:val="none"/>
+              </w:rPr>
+              <w:t>p.tstop = 6;</w:t>
+            </w:r>
           </w:p>
           <w:p>
             <w:pPr>
@@ -5291,75 +6087,15 @@
                 <w14:ligatures w14:val="none"/>
               </w:rPr>
             </w:pPr>
-            <w:proofErr w:type="spellStart"/>
-            <w:r>
-              <w:rPr>
-                <w:rFonts w:ascii="Consolas" w:eastAsia="Times New Roman" w:hAnsi="Consolas" w:cs="Times New Roman"/>
-                <w:kern w:val="0"/>
-                <w:sz w:val="20"/>
-                <w:szCs w:val="20"/>
-                <w14:ligatures w14:val="none"/>
-              </w:rPr>
-              <w:t>p.den</w:t>
-            </w:r>
-            <w:proofErr w:type="spellEnd"/>
-            <w:r>
-              <w:rPr>
-                <w:rFonts w:ascii="Consolas" w:eastAsia="Times New Roman" w:hAnsi="Consolas" w:cs="Times New Roman"/>
-                <w:kern w:val="0"/>
-                <w:sz w:val="20"/>
-                <w:szCs w:val="20"/>
-                <w14:ligatures w14:val="none"/>
-              </w:rPr>
-              <w:t xml:space="preserve"> = [</w:t>
-            </w:r>
-            <w:proofErr w:type="spellStart"/>
-            <w:proofErr w:type="gramStart"/>
-            <w:r>
-              <w:rPr>
-                <w:rFonts w:ascii="Consolas" w:eastAsia="Times New Roman" w:hAnsi="Consolas" w:cs="Times New Roman"/>
-                <w:kern w:val="0"/>
-                <w:sz w:val="20"/>
-                <w:szCs w:val="20"/>
-                <w14:ligatures w14:val="none"/>
-              </w:rPr>
-              <w:t>p.Jm</w:t>
-            </w:r>
-            <w:proofErr w:type="spellEnd"/>
-            <w:proofErr w:type="gramEnd"/>
-            <w:r>
-              <w:rPr>
-                <w:rFonts w:ascii="Consolas" w:eastAsia="Times New Roman" w:hAnsi="Consolas" w:cs="Times New Roman"/>
-                <w:kern w:val="0"/>
-                <w:sz w:val="20"/>
-                <w:szCs w:val="20"/>
-                <w14:ligatures w14:val="none"/>
-              </w:rPr>
-              <w:t xml:space="preserve"> * </w:t>
-            </w:r>
-            <w:proofErr w:type="spellStart"/>
-            <w:proofErr w:type="gramStart"/>
-            <w:r>
-              <w:rPr>
-                <w:rFonts w:ascii="Consolas" w:eastAsia="Times New Roman" w:hAnsi="Consolas" w:cs="Times New Roman"/>
-                <w:kern w:val="0"/>
-                <w:sz w:val="20"/>
-                <w:szCs w:val="20"/>
-                <w14:ligatures w14:val="none"/>
-              </w:rPr>
-              <w:t>p.La</w:t>
-            </w:r>
-            <w:proofErr w:type="spellEnd"/>
-            <w:proofErr w:type="gramEnd"/>
-            <w:r>
-              <w:rPr>
-                <w:rFonts w:ascii="Consolas" w:eastAsia="Times New Roman" w:hAnsi="Consolas" w:cs="Times New Roman"/>
-                <w:kern w:val="0"/>
-                <w:sz w:val="20"/>
-                <w:szCs w:val="20"/>
-                <w14:ligatures w14:val="none"/>
-              </w:rPr>
-              <w:t xml:space="preserve">, </w:t>
+            <w:r>
+              <w:rPr>
+                <w:rFonts w:ascii="Consolas" w:eastAsia="Times New Roman" w:hAnsi="Consolas" w:cs="Times New Roman"/>
+                <w:kern w:val="0"/>
+                <w:sz w:val="20"/>
+                <w:szCs w:val="20"/>
+                <w14:ligatures w14:val="none"/>
+              </w:rPr>
+              <w:t xml:space="preserve">p.den = [p.Jm * p.La, </w:t>
             </w:r>
             <w:r>
               <w:rPr>
@@ -5391,103 +6127,7 @@
                 <w:szCs w:val="20"/>
                 <w14:ligatures w14:val="none"/>
               </w:rPr>
-              <w:t xml:space="preserve">    </w:t>
-            </w:r>
-            <w:proofErr w:type="spellStart"/>
-            <w:proofErr w:type="gramStart"/>
-            <w:r>
-              <w:rPr>
-                <w:rFonts w:ascii="Consolas" w:eastAsia="Times New Roman" w:hAnsi="Consolas" w:cs="Times New Roman"/>
-                <w:kern w:val="0"/>
-                <w:sz w:val="20"/>
-                <w:szCs w:val="20"/>
-                <w14:ligatures w14:val="none"/>
-              </w:rPr>
-              <w:t>p.Jm</w:t>
-            </w:r>
-            <w:proofErr w:type="spellEnd"/>
-            <w:proofErr w:type="gramEnd"/>
-            <w:r>
-              <w:rPr>
-                <w:rFonts w:ascii="Consolas" w:eastAsia="Times New Roman" w:hAnsi="Consolas" w:cs="Times New Roman"/>
-                <w:kern w:val="0"/>
-                <w:sz w:val="20"/>
-                <w:szCs w:val="20"/>
-                <w14:ligatures w14:val="none"/>
-              </w:rPr>
-              <w:t xml:space="preserve"> * </w:t>
-            </w:r>
-            <w:proofErr w:type="spellStart"/>
-            <w:proofErr w:type="gramStart"/>
-            <w:r>
-              <w:rPr>
-                <w:rFonts w:ascii="Consolas" w:eastAsia="Times New Roman" w:hAnsi="Consolas" w:cs="Times New Roman"/>
-                <w:kern w:val="0"/>
-                <w:sz w:val="20"/>
-                <w:szCs w:val="20"/>
-                <w14:ligatures w14:val="none"/>
-              </w:rPr>
-              <w:t>p.Ra</w:t>
-            </w:r>
-            <w:proofErr w:type="spellEnd"/>
-            <w:proofErr w:type="gramEnd"/>
-            <w:r>
-              <w:rPr>
-                <w:rFonts w:ascii="Consolas" w:eastAsia="Times New Roman" w:hAnsi="Consolas" w:cs="Times New Roman"/>
-                <w:kern w:val="0"/>
-                <w:sz w:val="20"/>
-                <w:szCs w:val="20"/>
-                <w14:ligatures w14:val="none"/>
-              </w:rPr>
-              <w:t xml:space="preserve"> + </w:t>
-            </w:r>
-            <w:proofErr w:type="spellStart"/>
-            <w:proofErr w:type="gramStart"/>
-            <w:r>
-              <w:rPr>
-                <w:rFonts w:ascii="Consolas" w:eastAsia="Times New Roman" w:hAnsi="Consolas" w:cs="Times New Roman"/>
-                <w:kern w:val="0"/>
-                <w:sz w:val="20"/>
-                <w:szCs w:val="20"/>
-                <w14:ligatures w14:val="none"/>
-              </w:rPr>
-              <w:t>p.Bm</w:t>
-            </w:r>
-            <w:proofErr w:type="spellEnd"/>
-            <w:proofErr w:type="gramEnd"/>
-            <w:r>
-              <w:rPr>
-                <w:rFonts w:ascii="Consolas" w:eastAsia="Times New Roman" w:hAnsi="Consolas" w:cs="Times New Roman"/>
-                <w:kern w:val="0"/>
-                <w:sz w:val="20"/>
-                <w:szCs w:val="20"/>
-                <w14:ligatures w14:val="none"/>
-              </w:rPr>
-              <w:t xml:space="preserve"> * </w:t>
-            </w:r>
-            <w:proofErr w:type="spellStart"/>
-            <w:proofErr w:type="gramStart"/>
-            <w:r>
-              <w:rPr>
-                <w:rFonts w:ascii="Consolas" w:eastAsia="Times New Roman" w:hAnsi="Consolas" w:cs="Times New Roman"/>
-                <w:kern w:val="0"/>
-                <w:sz w:val="20"/>
-                <w:szCs w:val="20"/>
-                <w14:ligatures w14:val="none"/>
-              </w:rPr>
-              <w:t>p.La</w:t>
-            </w:r>
-            <w:proofErr w:type="spellEnd"/>
-            <w:proofErr w:type="gramEnd"/>
-            <w:r>
-              <w:rPr>
-                <w:rFonts w:ascii="Consolas" w:eastAsia="Times New Roman" w:hAnsi="Consolas" w:cs="Times New Roman"/>
-                <w:kern w:val="0"/>
-                <w:sz w:val="20"/>
-                <w:szCs w:val="20"/>
-                <w14:ligatures w14:val="none"/>
-              </w:rPr>
-              <w:t xml:space="preserve">, </w:t>
+              <w:t xml:space="preserve">    p.Jm * p.Ra + p.Bm * p.La, </w:t>
             </w:r>
             <w:r>
               <w:rPr>
@@ -5519,104 +6159,8 @@
                 <w:szCs w:val="20"/>
                 <w14:ligatures w14:val="none"/>
               </w:rPr>
-              <w:t xml:space="preserve">    </w:t>
-            </w:r>
-            <w:proofErr w:type="spellStart"/>
-            <w:proofErr w:type="gramStart"/>
-            <w:r>
-              <w:rPr>
-                <w:rFonts w:ascii="Consolas" w:eastAsia="Times New Roman" w:hAnsi="Consolas" w:cs="Times New Roman"/>
-                <w:kern w:val="0"/>
-                <w:sz w:val="20"/>
-                <w:szCs w:val="20"/>
-                <w14:ligatures w14:val="none"/>
-              </w:rPr>
-              <w:t>p.Bm</w:t>
-            </w:r>
-            <w:proofErr w:type="spellEnd"/>
-            <w:proofErr w:type="gramEnd"/>
-            <w:r>
-              <w:rPr>
-                <w:rFonts w:ascii="Consolas" w:eastAsia="Times New Roman" w:hAnsi="Consolas" w:cs="Times New Roman"/>
-                <w:kern w:val="0"/>
-                <w:sz w:val="20"/>
-                <w:szCs w:val="20"/>
-                <w14:ligatures w14:val="none"/>
-              </w:rPr>
-              <w:t xml:space="preserve"> * </w:t>
-            </w:r>
-            <w:proofErr w:type="spellStart"/>
-            <w:proofErr w:type="gramStart"/>
-            <w:r>
-              <w:rPr>
-                <w:rFonts w:ascii="Consolas" w:eastAsia="Times New Roman" w:hAnsi="Consolas" w:cs="Times New Roman"/>
-                <w:kern w:val="0"/>
-                <w:sz w:val="20"/>
-                <w:szCs w:val="20"/>
-                <w14:ligatures w14:val="none"/>
-              </w:rPr>
-              <w:t>p.Ra</w:t>
-            </w:r>
-            <w:proofErr w:type="spellEnd"/>
-            <w:proofErr w:type="gramEnd"/>
-            <w:r>
-              <w:rPr>
-                <w:rFonts w:ascii="Consolas" w:eastAsia="Times New Roman" w:hAnsi="Consolas" w:cs="Times New Roman"/>
-                <w:kern w:val="0"/>
-                <w:sz w:val="20"/>
-                <w:szCs w:val="20"/>
-                <w14:ligatures w14:val="none"/>
-              </w:rPr>
-              <w:t xml:space="preserve"> + </w:t>
-            </w:r>
-            <w:proofErr w:type="spellStart"/>
-            <w:proofErr w:type="gramStart"/>
-            <w:r>
-              <w:rPr>
-                <w:rFonts w:ascii="Consolas" w:eastAsia="Times New Roman" w:hAnsi="Consolas" w:cs="Times New Roman"/>
-                <w:kern w:val="0"/>
-                <w:sz w:val="20"/>
-                <w:szCs w:val="20"/>
-                <w14:ligatures w14:val="none"/>
-              </w:rPr>
-              <w:t>p.Ki</w:t>
-            </w:r>
-            <w:proofErr w:type="spellEnd"/>
-            <w:proofErr w:type="gramEnd"/>
-            <w:r>
-              <w:rPr>
-                <w:rFonts w:ascii="Consolas" w:eastAsia="Times New Roman" w:hAnsi="Consolas" w:cs="Times New Roman"/>
-                <w:kern w:val="0"/>
-                <w:sz w:val="20"/>
-                <w:szCs w:val="20"/>
-                <w14:ligatures w14:val="none"/>
-              </w:rPr>
-              <w:t xml:space="preserve"> * </w:t>
-            </w:r>
-            <w:proofErr w:type="spellStart"/>
-            <w:proofErr w:type="gramStart"/>
-            <w:r>
-              <w:rPr>
-                <w:rFonts w:ascii="Consolas" w:eastAsia="Times New Roman" w:hAnsi="Consolas" w:cs="Times New Roman"/>
-                <w:kern w:val="0"/>
-                <w:sz w:val="20"/>
-                <w:szCs w:val="20"/>
-                <w14:ligatures w14:val="none"/>
-              </w:rPr>
-              <w:t>p.Kb</w:t>
-            </w:r>
-            <w:proofErr w:type="spellEnd"/>
-            <w:r>
-              <w:rPr>
-                <w:rFonts w:ascii="Consolas" w:eastAsia="Times New Roman" w:hAnsi="Consolas" w:cs="Times New Roman"/>
-                <w:kern w:val="0"/>
-                <w:sz w:val="20"/>
-                <w:szCs w:val="20"/>
-                <w14:ligatures w14:val="none"/>
-              </w:rPr>
-              <w:t>];</w:t>
-            </w:r>
-            <w:proofErr w:type="gramEnd"/>
+              <w:t xml:space="preserve">    p.Bm * p.Ra + p.Ki * p.Kb];</w:t>
+            </w:r>
           </w:p>
           <w:p>
             <w:pPr>
@@ -5639,52 +6183,16 @@
                 <w14:ligatures w14:val="none"/>
               </w:rPr>
             </w:pPr>
-            <w:proofErr w:type="spellStart"/>
-            <w:r>
-              <w:rPr>
-                <w:rFonts w:ascii="Consolas" w:eastAsia="Times New Roman" w:hAnsi="Consolas" w:cs="Times New Roman"/>
-                <w:kern w:val="0"/>
-                <w:sz w:val="20"/>
-                <w:szCs w:val="20"/>
-                <w14:ligatures w14:val="none"/>
-              </w:rPr>
-              <w:t>p.num_v</w:t>
-            </w:r>
-            <w:proofErr w:type="spellEnd"/>
-            <w:r>
-              <w:rPr>
-                <w:rFonts w:ascii="Consolas" w:eastAsia="Times New Roman" w:hAnsi="Consolas" w:cs="Times New Roman"/>
-                <w:kern w:val="0"/>
-                <w:sz w:val="20"/>
-                <w:szCs w:val="20"/>
-                <w14:ligatures w14:val="none"/>
-              </w:rPr>
-              <w:t xml:space="preserve"> = [</w:t>
-            </w:r>
-            <w:proofErr w:type="spellStart"/>
-            <w:proofErr w:type="gramStart"/>
-            <w:r>
-              <w:rPr>
-                <w:rFonts w:ascii="Consolas" w:eastAsia="Times New Roman" w:hAnsi="Consolas" w:cs="Times New Roman"/>
-                <w:kern w:val="0"/>
-                <w:sz w:val="20"/>
-                <w:szCs w:val="20"/>
-                <w14:ligatures w14:val="none"/>
-              </w:rPr>
-              <w:t>p.Ki</w:t>
-            </w:r>
-            <w:proofErr w:type="spellEnd"/>
-            <w:r>
-              <w:rPr>
-                <w:rFonts w:ascii="Consolas" w:eastAsia="Times New Roman" w:hAnsi="Consolas" w:cs="Times New Roman"/>
-                <w:kern w:val="0"/>
-                <w:sz w:val="20"/>
-                <w:szCs w:val="20"/>
-                <w14:ligatures w14:val="none"/>
-              </w:rPr>
-              <w:t>];</w:t>
-            </w:r>
-            <w:proofErr w:type="gramEnd"/>
+            <w:r>
+              <w:rPr>
+                <w:rFonts w:ascii="Consolas" w:eastAsia="Times New Roman" w:hAnsi="Consolas" w:cs="Times New Roman"/>
+                <w:kern w:val="0"/>
+                <w:sz w:val="20"/>
+                <w:szCs w:val="20"/>
+                <w14:ligatures w14:val="none"/>
+              </w:rPr>
+              <w:t>p.num_v = [p.Ki];</w:t>
+            </w:r>
           </w:p>
           <w:p>
             <w:pPr>
@@ -5696,76 +6204,16 @@
                 <w14:ligatures w14:val="none"/>
               </w:rPr>
             </w:pPr>
-            <w:proofErr w:type="spellStart"/>
-            <w:r>
-              <w:rPr>
-                <w:rFonts w:ascii="Consolas" w:eastAsia="Times New Roman" w:hAnsi="Consolas" w:cs="Times New Roman"/>
-                <w:kern w:val="0"/>
-                <w:sz w:val="20"/>
-                <w:szCs w:val="20"/>
-                <w14:ligatures w14:val="none"/>
-              </w:rPr>
-              <w:t>p.num_d</w:t>
-            </w:r>
-            <w:proofErr w:type="spellEnd"/>
-            <w:r>
-              <w:rPr>
-                <w:rFonts w:ascii="Consolas" w:eastAsia="Times New Roman" w:hAnsi="Consolas" w:cs="Times New Roman"/>
-                <w:kern w:val="0"/>
-                <w:sz w:val="20"/>
-                <w:szCs w:val="20"/>
-                <w14:ligatures w14:val="none"/>
-              </w:rPr>
-              <w:t xml:space="preserve"> = [-</w:t>
-            </w:r>
-            <w:proofErr w:type="spellStart"/>
-            <w:proofErr w:type="gramStart"/>
-            <w:r>
-              <w:rPr>
-                <w:rFonts w:ascii="Consolas" w:eastAsia="Times New Roman" w:hAnsi="Consolas" w:cs="Times New Roman"/>
-                <w:kern w:val="0"/>
-                <w:sz w:val="20"/>
-                <w:szCs w:val="20"/>
-                <w14:ligatures w14:val="none"/>
-              </w:rPr>
-              <w:t>p.La</w:t>
-            </w:r>
-            <w:proofErr w:type="spellEnd"/>
-            <w:proofErr w:type="gramEnd"/>
-            <w:r>
-              <w:rPr>
-                <w:rFonts w:ascii="Consolas" w:eastAsia="Times New Roman" w:hAnsi="Consolas" w:cs="Times New Roman"/>
-                <w:kern w:val="0"/>
-                <w:sz w:val="20"/>
-                <w:szCs w:val="20"/>
-                <w14:ligatures w14:val="none"/>
-              </w:rPr>
-              <w:t>, -</w:t>
-            </w:r>
-            <w:proofErr w:type="spellStart"/>
-            <w:proofErr w:type="gramStart"/>
-            <w:r>
-              <w:rPr>
-                <w:rFonts w:ascii="Consolas" w:eastAsia="Times New Roman" w:hAnsi="Consolas" w:cs="Times New Roman"/>
-                <w:kern w:val="0"/>
-                <w:sz w:val="20"/>
-                <w:szCs w:val="20"/>
-                <w14:ligatures w14:val="none"/>
-              </w:rPr>
-              <w:t>p.Ra</w:t>
-            </w:r>
-            <w:proofErr w:type="spellEnd"/>
-            <w:r>
-              <w:rPr>
-                <w:rFonts w:ascii="Consolas" w:eastAsia="Times New Roman" w:hAnsi="Consolas" w:cs="Times New Roman"/>
-                <w:kern w:val="0"/>
-                <w:sz w:val="20"/>
-                <w:szCs w:val="20"/>
-                <w14:ligatures w14:val="none"/>
-              </w:rPr>
-              <w:t>];</w:t>
-            </w:r>
-            <w:proofErr w:type="gramEnd"/>
+            <w:r>
+              <w:rPr>
+                <w:rFonts w:ascii="Consolas" w:eastAsia="Times New Roman" w:hAnsi="Consolas" w:cs="Times New Roman"/>
+                <w:kern w:val="0"/>
+                <w:sz w:val="20"/>
+                <w:szCs w:val="20"/>
+                <w14:ligatures w14:val="none"/>
+              </w:rPr>
+              <w:t>p.num_d = [-p.La, -p.Ra];</w:t>
+            </w:r>
           </w:p>
           <w:p>
             <w:pPr>
@@ -5821,7 +6269,6 @@
                 <w14:ligatures w14:val="none"/>
               </w:rPr>
             </w:pPr>
-            <w:proofErr w:type="spellStart"/>
             <w:r>
               <w:rPr>
                 <w:rFonts w:ascii="Consolas" w:eastAsia="Times New Roman" w:hAnsi="Consolas" w:cs="Times New Roman"/>
@@ -5832,7 +6279,6 @@
               </w:rPr>
               <w:t>clc</w:t>
             </w:r>
-            <w:proofErr w:type="spellEnd"/>
           </w:p>
           <w:p>
             <w:pPr>
@@ -5844,7 +6290,6 @@
                 <w14:ligatures w14:val="none"/>
               </w:rPr>
             </w:pPr>
-            <w:proofErr w:type="gramStart"/>
             <w:r>
               <w:rPr>
                 <w:rFonts w:ascii="Consolas" w:eastAsia="Times New Roman" w:hAnsi="Consolas" w:cs="Times New Roman"/>
@@ -5855,7 +6300,6 @@
               </w:rPr>
               <w:t>clear;</w:t>
             </w:r>
-            <w:proofErr w:type="gramEnd"/>
           </w:p>
           <w:p>
             <w:pPr>
@@ -5877,7 +6321,6 @@
               </w:rPr>
               <w:t xml:space="preserve">close </w:t>
             </w:r>
-            <w:proofErr w:type="gramStart"/>
             <w:r>
               <w:rPr>
                 <w:rFonts w:ascii="Consolas" w:eastAsia="Times New Roman" w:hAnsi="Consolas" w:cs="Times New Roman"/>
@@ -5899,7 +6342,6 @@
               </w:rPr>
               <w:t>;</w:t>
             </w:r>
-            <w:proofErr w:type="gramEnd"/>
           </w:p>
           <w:p>
             <w:pPr>
@@ -5952,20 +6394,8 @@
                 <w:szCs w:val="20"/>
                 <w14:ligatures w14:val="none"/>
               </w:rPr>
-              <w:t xml:space="preserve">p = </w:t>
-            </w:r>
-            <w:proofErr w:type="gramStart"/>
-            <w:r>
-              <w:rPr>
-                <w:rFonts w:ascii="Consolas" w:eastAsia="Times New Roman" w:hAnsi="Consolas" w:cs="Times New Roman"/>
-                <w:kern w:val="0"/>
-                <w:sz w:val="20"/>
-                <w:szCs w:val="20"/>
-                <w14:ligatures w14:val="none"/>
-              </w:rPr>
-              <w:t>params();</w:t>
-            </w:r>
-            <w:proofErr w:type="gramEnd"/>
+              <w:t>p = params();</w:t>
+            </w:r>
           </w:p>
           <w:p>
             <w:pPr>
@@ -6010,42 +6440,16 @@
                 <w14:ligatures w14:val="none"/>
               </w:rPr>
             </w:pPr>
-            <w:proofErr w:type="spellStart"/>
-            <w:proofErr w:type="gramStart"/>
-            <w:r>
-              <w:rPr>
-                <w:rFonts w:ascii="Consolas" w:eastAsia="Times New Roman" w:hAnsi="Consolas" w:cs="Times New Roman"/>
-                <w:kern w:val="0"/>
-                <w:sz w:val="20"/>
-                <w:szCs w:val="20"/>
-                <w14:ligatures w14:val="none"/>
-              </w:rPr>
-              <w:t>p.Ea</w:t>
-            </w:r>
-            <w:proofErr w:type="spellEnd"/>
-            <w:proofErr w:type="gramEnd"/>
-            <w:r>
-              <w:rPr>
-                <w:rFonts w:ascii="Consolas" w:eastAsia="Times New Roman" w:hAnsi="Consolas" w:cs="Times New Roman"/>
-                <w:kern w:val="0"/>
-                <w:sz w:val="20"/>
-                <w:szCs w:val="20"/>
-                <w14:ligatures w14:val="none"/>
-              </w:rPr>
-              <w:t xml:space="preserve"> = </w:t>
-            </w:r>
-            <w:proofErr w:type="gramStart"/>
-            <w:r>
-              <w:rPr>
-                <w:rFonts w:ascii="Consolas" w:eastAsia="Times New Roman" w:hAnsi="Consolas" w:cs="Times New Roman"/>
-                <w:kern w:val="0"/>
-                <w:sz w:val="20"/>
-                <w:szCs w:val="20"/>
-                <w14:ligatures w14:val="none"/>
-              </w:rPr>
-              <w:t>20;</w:t>
-            </w:r>
-            <w:proofErr w:type="gramEnd"/>
+            <w:r>
+              <w:rPr>
+                <w:rFonts w:ascii="Consolas" w:eastAsia="Times New Roman" w:hAnsi="Consolas" w:cs="Times New Roman"/>
+                <w:kern w:val="0"/>
+                <w:sz w:val="20"/>
+                <w:szCs w:val="20"/>
+                <w14:ligatures w14:val="none"/>
+              </w:rPr>
+              <w:t>p.Ea = 20;</w:t>
+            </w:r>
           </w:p>
           <w:p>
             <w:pPr>
@@ -6109,32 +6513,7 @@
                 <w:szCs w:val="20"/>
                 <w14:ligatures w14:val="none"/>
               </w:rPr>
-              <w:t>'</w:t>
-            </w:r>
-            <w:proofErr w:type="spellStart"/>
-            <w:r>
-              <w:rPr>
-                <w:rFonts w:ascii="Consolas" w:eastAsia="Times New Roman" w:hAnsi="Consolas" w:cs="Times New Roman"/>
-                <w:color w:val="A709F5"/>
-                <w:kern w:val="0"/>
-                <w:sz w:val="20"/>
-                <w:szCs w:val="20"/>
-                <w14:ligatures w14:val="none"/>
-              </w:rPr>
-              <w:t>sim_open</w:t>
-            </w:r>
-            <w:proofErr w:type="spellEnd"/>
-            <w:proofErr w:type="gramStart"/>
-            <w:r>
-              <w:rPr>
-                <w:rFonts w:ascii="Consolas" w:eastAsia="Times New Roman" w:hAnsi="Consolas" w:cs="Times New Roman"/>
-                <w:color w:val="A709F5"/>
-                <w:kern w:val="0"/>
-                <w:sz w:val="20"/>
-                <w:szCs w:val="20"/>
-                <w14:ligatures w14:val="none"/>
-              </w:rPr>
-              <w:t>'</w:t>
+              <w:t>'sim_open'</w:t>
             </w:r>
             <w:r>
               <w:rPr>
@@ -6146,7 +6525,6 @@
               </w:rPr>
               <w:t>;</w:t>
             </w:r>
-            <w:proofErr w:type="gramEnd"/>
           </w:p>
           <w:p>
             <w:pPr>
@@ -6169,62 +6547,16 @@
                 <w14:ligatures w14:val="none"/>
               </w:rPr>
             </w:pPr>
-            <w:proofErr w:type="spellStart"/>
-            <w:r>
-              <w:rPr>
-                <w:rFonts w:ascii="Consolas" w:eastAsia="Times New Roman" w:hAnsi="Consolas" w:cs="Times New Roman"/>
-                <w:kern w:val="0"/>
-                <w:sz w:val="20"/>
-                <w:szCs w:val="20"/>
-                <w14:ligatures w14:val="none"/>
-              </w:rPr>
-              <w:t>simIn</w:t>
-            </w:r>
-            <w:proofErr w:type="spellEnd"/>
-            <w:r>
-              <w:rPr>
-                <w:rFonts w:ascii="Consolas" w:eastAsia="Times New Roman" w:hAnsi="Consolas" w:cs="Times New Roman"/>
-                <w:kern w:val="0"/>
-                <w:sz w:val="20"/>
-                <w:szCs w:val="20"/>
-                <w14:ligatures w14:val="none"/>
-              </w:rPr>
-              <w:t xml:space="preserve"> = </w:t>
-            </w:r>
-            <w:proofErr w:type="spellStart"/>
-            <w:r>
-              <w:rPr>
-                <w:rFonts w:ascii="Consolas" w:eastAsia="Times New Roman" w:hAnsi="Consolas" w:cs="Times New Roman"/>
-                <w:kern w:val="0"/>
-                <w:sz w:val="20"/>
-                <w:szCs w:val="20"/>
-                <w14:ligatures w14:val="none"/>
-              </w:rPr>
-              <w:t>Simulink.SimulationInput</w:t>
-            </w:r>
-            <w:proofErr w:type="spellEnd"/>
-            <w:r>
-              <w:rPr>
-                <w:rFonts w:ascii="Consolas" w:eastAsia="Times New Roman" w:hAnsi="Consolas" w:cs="Times New Roman"/>
-                <w:kern w:val="0"/>
-                <w:sz w:val="20"/>
-                <w:szCs w:val="20"/>
-                <w14:ligatures w14:val="none"/>
-              </w:rPr>
-              <w:t>(model</w:t>
-            </w:r>
-            <w:proofErr w:type="gramStart"/>
-            <w:r>
-              <w:rPr>
-                <w:rFonts w:ascii="Consolas" w:eastAsia="Times New Roman" w:hAnsi="Consolas" w:cs="Times New Roman"/>
-                <w:kern w:val="0"/>
-                <w:sz w:val="20"/>
-                <w:szCs w:val="20"/>
-                <w14:ligatures w14:val="none"/>
-              </w:rPr>
-              <w:t>);</w:t>
-            </w:r>
-            <w:proofErr w:type="gramEnd"/>
+            <w:r>
+              <w:rPr>
+                <w:rFonts w:ascii="Consolas" w:eastAsia="Times New Roman" w:hAnsi="Consolas" w:cs="Times New Roman"/>
+                <w:kern w:val="0"/>
+                <w:sz w:val="20"/>
+                <w:szCs w:val="20"/>
+                <w14:ligatures w14:val="none"/>
+              </w:rPr>
+              <w:t>simIn = Simulink.SimulationInput(model);</w:t>
+            </w:r>
           </w:p>
           <w:p>
             <w:pPr>
@@ -6236,49 +6568,15 @@
                 <w14:ligatures w14:val="none"/>
               </w:rPr>
             </w:pPr>
-            <w:proofErr w:type="spellStart"/>
-            <w:r>
-              <w:rPr>
-                <w:rFonts w:ascii="Consolas" w:eastAsia="Times New Roman" w:hAnsi="Consolas" w:cs="Times New Roman"/>
-                <w:kern w:val="0"/>
-                <w:sz w:val="20"/>
-                <w:szCs w:val="20"/>
-                <w14:ligatures w14:val="none"/>
-              </w:rPr>
-              <w:t>simIn</w:t>
-            </w:r>
-            <w:proofErr w:type="spellEnd"/>
-            <w:r>
-              <w:rPr>
-                <w:rFonts w:ascii="Consolas" w:eastAsia="Times New Roman" w:hAnsi="Consolas" w:cs="Times New Roman"/>
-                <w:kern w:val="0"/>
-                <w:sz w:val="20"/>
-                <w:szCs w:val="20"/>
-                <w14:ligatures w14:val="none"/>
-              </w:rPr>
-              <w:t xml:space="preserve"> = </w:t>
-            </w:r>
-            <w:proofErr w:type="spellStart"/>
-            <w:r>
-              <w:rPr>
-                <w:rFonts w:ascii="Consolas" w:eastAsia="Times New Roman" w:hAnsi="Consolas" w:cs="Times New Roman"/>
-                <w:kern w:val="0"/>
-                <w:sz w:val="20"/>
-                <w:szCs w:val="20"/>
-                <w14:ligatures w14:val="none"/>
-              </w:rPr>
-              <w:t>simIn.setVariable</w:t>
-            </w:r>
-            <w:proofErr w:type="spellEnd"/>
-            <w:r>
-              <w:rPr>
-                <w:rFonts w:ascii="Consolas" w:eastAsia="Times New Roman" w:hAnsi="Consolas" w:cs="Times New Roman"/>
-                <w:kern w:val="0"/>
-                <w:sz w:val="20"/>
-                <w:szCs w:val="20"/>
-                <w14:ligatures w14:val="none"/>
-              </w:rPr>
-              <w:t>(</w:t>
+            <w:r>
+              <w:rPr>
+                <w:rFonts w:ascii="Consolas" w:eastAsia="Times New Roman" w:hAnsi="Consolas" w:cs="Times New Roman"/>
+                <w:kern w:val="0"/>
+                <w:sz w:val="20"/>
+                <w:szCs w:val="20"/>
+                <w14:ligatures w14:val="none"/>
+              </w:rPr>
+              <w:t>simIn = simIn.setVariable(</w:t>
             </w:r>
             <w:r>
               <w:rPr>
@@ -6299,20 +6597,8 @@
                 <w:szCs w:val="20"/>
                 <w14:ligatures w14:val="none"/>
               </w:rPr>
-              <w:t>, p</w:t>
-            </w:r>
-            <w:proofErr w:type="gramStart"/>
-            <w:r>
-              <w:rPr>
-                <w:rFonts w:ascii="Consolas" w:eastAsia="Times New Roman" w:hAnsi="Consolas" w:cs="Times New Roman"/>
-                <w:kern w:val="0"/>
-                <w:sz w:val="20"/>
-                <w:szCs w:val="20"/>
-                <w14:ligatures w14:val="none"/>
-              </w:rPr>
-              <w:t>);</w:t>
-            </w:r>
-            <w:proofErr w:type="gramEnd"/>
+              <w:t>, p);</w:t>
+            </w:r>
           </w:p>
           <w:p>
             <w:pPr>
@@ -6324,49 +6610,15 @@
                 <w14:ligatures w14:val="none"/>
               </w:rPr>
             </w:pPr>
-            <w:proofErr w:type="spellStart"/>
-            <w:r>
-              <w:rPr>
-                <w:rFonts w:ascii="Consolas" w:eastAsia="Times New Roman" w:hAnsi="Consolas" w:cs="Times New Roman"/>
-                <w:kern w:val="0"/>
-                <w:sz w:val="20"/>
-                <w:szCs w:val="20"/>
-                <w14:ligatures w14:val="none"/>
-              </w:rPr>
-              <w:t>simIn</w:t>
-            </w:r>
-            <w:proofErr w:type="spellEnd"/>
-            <w:r>
-              <w:rPr>
-                <w:rFonts w:ascii="Consolas" w:eastAsia="Times New Roman" w:hAnsi="Consolas" w:cs="Times New Roman"/>
-                <w:kern w:val="0"/>
-                <w:sz w:val="20"/>
-                <w:szCs w:val="20"/>
-                <w14:ligatures w14:val="none"/>
-              </w:rPr>
-              <w:t xml:space="preserve"> = </w:t>
-            </w:r>
-            <w:proofErr w:type="spellStart"/>
-            <w:r>
-              <w:rPr>
-                <w:rFonts w:ascii="Consolas" w:eastAsia="Times New Roman" w:hAnsi="Consolas" w:cs="Times New Roman"/>
-                <w:kern w:val="0"/>
-                <w:sz w:val="20"/>
-                <w:szCs w:val="20"/>
-                <w14:ligatures w14:val="none"/>
-              </w:rPr>
-              <w:t>simIn.setModelParameter</w:t>
-            </w:r>
-            <w:proofErr w:type="spellEnd"/>
-            <w:r>
-              <w:rPr>
-                <w:rFonts w:ascii="Consolas" w:eastAsia="Times New Roman" w:hAnsi="Consolas" w:cs="Times New Roman"/>
-                <w:kern w:val="0"/>
-                <w:sz w:val="20"/>
-                <w:szCs w:val="20"/>
-                <w14:ligatures w14:val="none"/>
-              </w:rPr>
-              <w:t>(</w:t>
+            <w:r>
+              <w:rPr>
+                <w:rFonts w:ascii="Consolas" w:eastAsia="Times New Roman" w:hAnsi="Consolas" w:cs="Times New Roman"/>
+                <w:kern w:val="0"/>
+                <w:sz w:val="20"/>
+                <w:szCs w:val="20"/>
+                <w14:ligatures w14:val="none"/>
+              </w:rPr>
+              <w:t>simIn = simIn.setModelParameter(</w:t>
             </w:r>
             <w:r>
               <w:rPr>
@@ -6377,78 +6629,18 @@
                 <w:szCs w:val="20"/>
                 <w14:ligatures w14:val="none"/>
               </w:rPr>
-              <w:t>'</w:t>
-            </w:r>
-            <w:proofErr w:type="spellStart"/>
-            <w:r>
-              <w:rPr>
-                <w:rFonts w:ascii="Consolas" w:eastAsia="Times New Roman" w:hAnsi="Consolas" w:cs="Times New Roman"/>
-                <w:color w:val="A709F5"/>
-                <w:kern w:val="0"/>
-                <w:sz w:val="20"/>
-                <w:szCs w:val="20"/>
-                <w14:ligatures w14:val="none"/>
-              </w:rPr>
-              <w:t>StopTime</w:t>
-            </w:r>
-            <w:proofErr w:type="spellEnd"/>
-            <w:r>
-              <w:rPr>
-                <w:rFonts w:ascii="Consolas" w:eastAsia="Times New Roman" w:hAnsi="Consolas" w:cs="Times New Roman"/>
-                <w:color w:val="A709F5"/>
-                <w:kern w:val="0"/>
-                <w:sz w:val="20"/>
-                <w:szCs w:val="20"/>
-                <w14:ligatures w14:val="none"/>
-              </w:rPr>
-              <w:t>'</w:t>
-            </w:r>
-            <w:r>
-              <w:rPr>
-                <w:rFonts w:ascii="Consolas" w:eastAsia="Times New Roman" w:hAnsi="Consolas" w:cs="Times New Roman"/>
-                <w:kern w:val="0"/>
-                <w:sz w:val="20"/>
-                <w:szCs w:val="20"/>
-                <w14:ligatures w14:val="none"/>
-              </w:rPr>
-              <w:t>, num2str(</w:t>
-            </w:r>
-            <w:proofErr w:type="spellStart"/>
-            <w:proofErr w:type="gramStart"/>
-            <w:r>
-              <w:rPr>
-                <w:rFonts w:ascii="Consolas" w:eastAsia="Times New Roman" w:hAnsi="Consolas" w:cs="Times New Roman"/>
-                <w:kern w:val="0"/>
-                <w:sz w:val="20"/>
-                <w:szCs w:val="20"/>
-                <w14:ligatures w14:val="none"/>
-              </w:rPr>
-              <w:t>p.tstop</w:t>
-            </w:r>
-            <w:proofErr w:type="spellEnd"/>
-            <w:proofErr w:type="gramEnd"/>
-            <w:r>
-              <w:rPr>
-                <w:rFonts w:ascii="Consolas" w:eastAsia="Times New Roman" w:hAnsi="Consolas" w:cs="Times New Roman"/>
-                <w:kern w:val="0"/>
-                <w:sz w:val="20"/>
-                <w:szCs w:val="20"/>
-                <w14:ligatures w14:val="none"/>
-              </w:rPr>
-              <w:t>)</w:t>
-            </w:r>
-            <w:proofErr w:type="gramStart"/>
-            <w:r>
-              <w:rPr>
-                <w:rFonts w:ascii="Consolas" w:eastAsia="Times New Roman" w:hAnsi="Consolas" w:cs="Times New Roman"/>
-                <w:kern w:val="0"/>
-                <w:sz w:val="20"/>
-                <w:szCs w:val="20"/>
-                <w14:ligatures w14:val="none"/>
-              </w:rPr>
-              <w:t>);</w:t>
-            </w:r>
-            <w:proofErr w:type="gramEnd"/>
+              <w:t>'StopTime'</w:t>
+            </w:r>
+            <w:r>
+              <w:rPr>
+                <w:rFonts w:ascii="Consolas" w:eastAsia="Times New Roman" w:hAnsi="Consolas" w:cs="Times New Roman"/>
+                <w:kern w:val="0"/>
+                <w:sz w:val="20"/>
+                <w:szCs w:val="20"/>
+                <w14:ligatures w14:val="none"/>
+              </w:rPr>
+              <w:t>, num2str(p.tstop));</w:t>
+            </w:r>
           </w:p>
           <w:p>
             <w:pPr>
@@ -6460,52 +6652,16 @@
                 <w14:ligatures w14:val="none"/>
               </w:rPr>
             </w:pPr>
-            <w:proofErr w:type="spellStart"/>
-            <w:r>
-              <w:rPr>
-                <w:rFonts w:ascii="Consolas" w:eastAsia="Times New Roman" w:hAnsi="Consolas" w:cs="Times New Roman"/>
-                <w:kern w:val="0"/>
-                <w:sz w:val="20"/>
-                <w:szCs w:val="20"/>
-                <w14:ligatures w14:val="none"/>
-              </w:rPr>
-              <w:t>simOut</w:t>
-            </w:r>
-            <w:proofErr w:type="spellEnd"/>
-            <w:r>
-              <w:rPr>
-                <w:rFonts w:ascii="Consolas" w:eastAsia="Times New Roman" w:hAnsi="Consolas" w:cs="Times New Roman"/>
-                <w:kern w:val="0"/>
-                <w:sz w:val="20"/>
-                <w:szCs w:val="20"/>
-                <w14:ligatures w14:val="none"/>
-              </w:rPr>
-              <w:t xml:space="preserve"> = sim(</w:t>
-            </w:r>
-            <w:proofErr w:type="spellStart"/>
-            <w:r>
-              <w:rPr>
-                <w:rFonts w:ascii="Consolas" w:eastAsia="Times New Roman" w:hAnsi="Consolas" w:cs="Times New Roman"/>
-                <w:kern w:val="0"/>
-                <w:sz w:val="20"/>
-                <w:szCs w:val="20"/>
-                <w14:ligatures w14:val="none"/>
-              </w:rPr>
-              <w:t>simIn</w:t>
-            </w:r>
-            <w:proofErr w:type="spellEnd"/>
-            <w:proofErr w:type="gramStart"/>
-            <w:r>
-              <w:rPr>
-                <w:rFonts w:ascii="Consolas" w:eastAsia="Times New Roman" w:hAnsi="Consolas" w:cs="Times New Roman"/>
-                <w:kern w:val="0"/>
-                <w:sz w:val="20"/>
-                <w:szCs w:val="20"/>
-                <w14:ligatures w14:val="none"/>
-              </w:rPr>
-              <w:t>);</w:t>
-            </w:r>
-            <w:proofErr w:type="gramEnd"/>
+            <w:r>
+              <w:rPr>
+                <w:rFonts w:ascii="Consolas" w:eastAsia="Times New Roman" w:hAnsi="Consolas" w:cs="Times New Roman"/>
+                <w:kern w:val="0"/>
+                <w:sz w:val="20"/>
+                <w:szCs w:val="20"/>
+                <w14:ligatures w14:val="none"/>
+              </w:rPr>
+              <w:t>simOut = sim(simIn);</w:t>
+            </w:r>
           </w:p>
           <w:p>
             <w:pPr>
@@ -6536,31 +6692,7 @@
                 <w:szCs w:val="20"/>
                 <w14:ligatures w14:val="none"/>
               </w:rPr>
-              <w:t xml:space="preserve">t = </w:t>
-            </w:r>
-            <w:proofErr w:type="spellStart"/>
-            <w:proofErr w:type="gramStart"/>
-            <w:r>
-              <w:rPr>
-                <w:rFonts w:ascii="Consolas" w:eastAsia="Times New Roman" w:hAnsi="Consolas" w:cs="Times New Roman"/>
-                <w:kern w:val="0"/>
-                <w:sz w:val="20"/>
-                <w:szCs w:val="20"/>
-                <w14:ligatures w14:val="none"/>
-              </w:rPr>
-              <w:t>simOut.wm.Time</w:t>
-            </w:r>
-            <w:proofErr w:type="spellEnd"/>
-            <w:proofErr w:type="gramEnd"/>
-            <w:r>
-              <w:rPr>
-                <w:rFonts w:ascii="Consolas" w:eastAsia="Times New Roman" w:hAnsi="Consolas" w:cs="Times New Roman"/>
-                <w:kern w:val="0"/>
-                <w:sz w:val="20"/>
-                <w:szCs w:val="20"/>
-                <w14:ligatures w14:val="none"/>
-              </w:rPr>
-              <w:t>;</w:t>
+              <w:t>t = simOut.wm.Time;</w:t>
             </w:r>
           </w:p>
           <w:p>
@@ -6573,51 +6705,15 @@
                 <w14:ligatures w14:val="none"/>
               </w:rPr>
             </w:pPr>
-            <w:proofErr w:type="spellStart"/>
-            <w:r>
-              <w:rPr>
-                <w:rFonts w:ascii="Consolas" w:eastAsia="Times New Roman" w:hAnsi="Consolas" w:cs="Times New Roman"/>
-                <w:kern w:val="0"/>
-                <w:sz w:val="20"/>
-                <w:szCs w:val="20"/>
-                <w14:ligatures w14:val="none"/>
-              </w:rPr>
-              <w:t>wm</w:t>
-            </w:r>
-            <w:proofErr w:type="spellEnd"/>
-            <w:r>
-              <w:rPr>
-                <w:rFonts w:ascii="Consolas" w:eastAsia="Times New Roman" w:hAnsi="Consolas" w:cs="Times New Roman"/>
-                <w:kern w:val="0"/>
-                <w:sz w:val="20"/>
-                <w:szCs w:val="20"/>
-                <w14:ligatures w14:val="none"/>
-              </w:rPr>
-              <w:t xml:space="preserve"> = </w:t>
-            </w:r>
-            <w:proofErr w:type="spellStart"/>
-            <w:proofErr w:type="gramStart"/>
-            <w:r>
-              <w:rPr>
-                <w:rFonts w:ascii="Consolas" w:eastAsia="Times New Roman" w:hAnsi="Consolas" w:cs="Times New Roman"/>
-                <w:kern w:val="0"/>
-                <w:sz w:val="20"/>
-                <w:szCs w:val="20"/>
-                <w14:ligatures w14:val="none"/>
-              </w:rPr>
-              <w:t>simOut.wm.Data</w:t>
-            </w:r>
-            <w:proofErr w:type="spellEnd"/>
-            <w:proofErr w:type="gramEnd"/>
-            <w:r>
-              <w:rPr>
-                <w:rFonts w:ascii="Consolas" w:eastAsia="Times New Roman" w:hAnsi="Consolas" w:cs="Times New Roman"/>
-                <w:kern w:val="0"/>
-                <w:sz w:val="20"/>
-                <w:szCs w:val="20"/>
-                <w14:ligatures w14:val="none"/>
-              </w:rPr>
-              <w:t>;</w:t>
+            <w:r>
+              <w:rPr>
+                <w:rFonts w:ascii="Consolas" w:eastAsia="Times New Roman" w:hAnsi="Consolas" w:cs="Times New Roman"/>
+                <w:kern w:val="0"/>
+                <w:sz w:val="20"/>
+                <w:szCs w:val="20"/>
+                <w14:ligatures w14:val="none"/>
+              </w:rPr>
+              <w:t>wm = simOut.wm.Data;</w:t>
             </w:r>
           </w:p>
           <w:p>
@@ -6649,66 +6745,8 @@
                 <w:szCs w:val="20"/>
                 <w14:ligatures w14:val="none"/>
               </w:rPr>
-              <w:t xml:space="preserve">info = </w:t>
-            </w:r>
-            <w:proofErr w:type="spellStart"/>
-            <w:proofErr w:type="gramStart"/>
-            <w:r>
-              <w:rPr>
-                <w:rFonts w:ascii="Consolas" w:eastAsia="Times New Roman" w:hAnsi="Consolas" w:cs="Times New Roman"/>
-                <w:kern w:val="0"/>
-                <w:sz w:val="20"/>
-                <w:szCs w:val="20"/>
-                <w14:ligatures w14:val="none"/>
-              </w:rPr>
-              <w:t>stepinfo</w:t>
-            </w:r>
-            <w:proofErr w:type="spellEnd"/>
-            <w:r>
-              <w:rPr>
-                <w:rFonts w:ascii="Consolas" w:eastAsia="Times New Roman" w:hAnsi="Consolas" w:cs="Times New Roman"/>
-                <w:kern w:val="0"/>
-                <w:sz w:val="20"/>
-                <w:szCs w:val="20"/>
-                <w14:ligatures w14:val="none"/>
-              </w:rPr>
-              <w:t>(</w:t>
-            </w:r>
-            <w:proofErr w:type="gramEnd"/>
-            <w:r>
-              <w:rPr>
-                <w:rFonts w:ascii="Consolas" w:eastAsia="Times New Roman" w:hAnsi="Consolas" w:cs="Times New Roman"/>
-                <w:kern w:val="0"/>
-                <w:sz w:val="20"/>
-                <w:szCs w:val="20"/>
-                <w14:ligatures w14:val="none"/>
-              </w:rPr>
-              <w:t xml:space="preserve">t, </w:t>
-            </w:r>
-            <w:proofErr w:type="spellStart"/>
-            <w:r>
-              <w:rPr>
-                <w:rFonts w:ascii="Consolas" w:eastAsia="Times New Roman" w:hAnsi="Consolas" w:cs="Times New Roman"/>
-                <w:kern w:val="0"/>
-                <w:sz w:val="20"/>
-                <w:szCs w:val="20"/>
-                <w14:ligatures w14:val="none"/>
-              </w:rPr>
-              <w:t>wm</w:t>
-            </w:r>
-            <w:proofErr w:type="spellEnd"/>
-            <w:proofErr w:type="gramStart"/>
-            <w:r>
-              <w:rPr>
-                <w:rFonts w:ascii="Consolas" w:eastAsia="Times New Roman" w:hAnsi="Consolas" w:cs="Times New Roman"/>
-                <w:kern w:val="0"/>
-                <w:sz w:val="20"/>
-                <w:szCs w:val="20"/>
-                <w14:ligatures w14:val="none"/>
-              </w:rPr>
-              <w:t>);</w:t>
-            </w:r>
-            <w:proofErr w:type="gramEnd"/>
+              <w:t>info = stepinfo(t, wm);</w:t>
+            </w:r>
           </w:p>
           <w:p>
             <w:pPr>
@@ -6720,40 +6758,16 @@
                 <w14:ligatures w14:val="none"/>
               </w:rPr>
             </w:pPr>
-            <w:proofErr w:type="spellStart"/>
-            <w:r>
-              <w:rPr>
-                <w:rFonts w:ascii="Consolas" w:eastAsia="Times New Roman" w:hAnsi="Consolas" w:cs="Times New Roman"/>
-                <w:kern w:val="0"/>
-                <w:sz w:val="20"/>
-                <w:szCs w:val="20"/>
-                <w14:ligatures w14:val="none"/>
-              </w:rPr>
-              <w:t>disp</w:t>
-            </w:r>
-            <w:proofErr w:type="spellEnd"/>
-            <w:r>
-              <w:rPr>
-                <w:rFonts w:ascii="Consolas" w:eastAsia="Times New Roman" w:hAnsi="Consolas" w:cs="Times New Roman"/>
-                <w:kern w:val="0"/>
-                <w:sz w:val="20"/>
-                <w:szCs w:val="20"/>
-                <w14:ligatures w14:val="none"/>
-              </w:rPr>
-              <w:t>(info</w:t>
-            </w:r>
-            <w:proofErr w:type="gramStart"/>
-            <w:r>
-              <w:rPr>
-                <w:rFonts w:ascii="Consolas" w:eastAsia="Times New Roman" w:hAnsi="Consolas" w:cs="Times New Roman"/>
-                <w:kern w:val="0"/>
-                <w:sz w:val="20"/>
-                <w:szCs w:val="20"/>
-                <w14:ligatures w14:val="none"/>
-              </w:rPr>
-              <w:t>);</w:t>
-            </w:r>
-            <w:proofErr w:type="gramEnd"/>
+            <w:r>
+              <w:rPr>
+                <w:rFonts w:ascii="Consolas" w:eastAsia="Times New Roman" w:hAnsi="Consolas" w:cs="Times New Roman"/>
+                <w:kern w:val="0"/>
+                <w:sz w:val="20"/>
+                <w:szCs w:val="20"/>
+                <w14:ligatures w14:val="none"/>
+              </w:rPr>
+              <w:t>disp(info);</w:t>
+            </w:r>
           </w:p>
           <w:p>
             <w:pPr>
@@ -6776,52 +6790,16 @@
                 <w14:ligatures w14:val="none"/>
               </w:rPr>
             </w:pPr>
-            <w:proofErr w:type="gramStart"/>
-            <w:r>
-              <w:rPr>
-                <w:rFonts w:ascii="Consolas" w:eastAsia="Times New Roman" w:hAnsi="Consolas" w:cs="Times New Roman"/>
-                <w:kern w:val="0"/>
-                <w:sz w:val="20"/>
-                <w:szCs w:val="20"/>
-                <w14:ligatures w14:val="none"/>
-              </w:rPr>
-              <w:t>plot(</w:t>
-            </w:r>
-            <w:proofErr w:type="gramEnd"/>
-            <w:r>
-              <w:rPr>
-                <w:rFonts w:ascii="Consolas" w:eastAsia="Times New Roman" w:hAnsi="Consolas" w:cs="Times New Roman"/>
-                <w:kern w:val="0"/>
-                <w:sz w:val="20"/>
-                <w:szCs w:val="20"/>
-                <w14:ligatures w14:val="none"/>
-              </w:rPr>
-              <w:t xml:space="preserve">t, </w:t>
-            </w:r>
-            <w:proofErr w:type="spellStart"/>
-            <w:r>
-              <w:rPr>
-                <w:rFonts w:ascii="Consolas" w:eastAsia="Times New Roman" w:hAnsi="Consolas" w:cs="Times New Roman"/>
-                <w:kern w:val="0"/>
-                <w:sz w:val="20"/>
-                <w:szCs w:val="20"/>
-                <w14:ligatures w14:val="none"/>
-              </w:rPr>
-              <w:t>wm</w:t>
-            </w:r>
-            <w:proofErr w:type="spellEnd"/>
-            <w:proofErr w:type="gramStart"/>
-            <w:r>
-              <w:rPr>
-                <w:rFonts w:ascii="Consolas" w:eastAsia="Times New Roman" w:hAnsi="Consolas" w:cs="Times New Roman"/>
-                <w:kern w:val="0"/>
-                <w:sz w:val="20"/>
-                <w:szCs w:val="20"/>
-                <w14:ligatures w14:val="none"/>
-              </w:rPr>
-              <w:t>);</w:t>
-            </w:r>
-            <w:proofErr w:type="gramEnd"/>
+            <w:r>
+              <w:rPr>
+                <w:rFonts w:ascii="Consolas" w:eastAsia="Times New Roman" w:hAnsi="Consolas" w:cs="Times New Roman"/>
+                <w:kern w:val="0"/>
+                <w:sz w:val="20"/>
+                <w:szCs w:val="20"/>
+                <w14:ligatures w14:val="none"/>
+              </w:rPr>
+              <w:t>plot(t, wm);</w:t>
+            </w:r>
           </w:p>
           <w:p/>
         </w:tc>
@@ -8381,7 +8359,6 @@
     <w:name w:val="Normal (Web)"/>
     <w:basedOn w:val="Normal"/>
     <w:uiPriority w:val="99"/>
-    <w:semiHidden/>
     <w:unhideWhenUsed/>
     <w:rsid w:val="001E60D6"/>
     <w:pPr>

</xml_diff>